<commit_message>
Record simulated nearest-distance implementation and verified results
</commit_message>
<xml_diff>
--- a/docs/research-diary.docx
+++ b/docs/research-diary.docx
@@ -1180,6 +1180,96 @@
       </w:pPr>
       <w:r>
         <w:t>公开副本位于仓库docs/research-diary.docx与docs/development-log.txt；docs/CONTINUE_HERE.txt记录当前做到哪里、哪些还没做、需要先读哪些文件。文档是本次同步的快照，不是自动实时同步服务；以后每一步继续核对并提交。没有Jetson时可以阅读、讨论和修改代码，但ROS运行及真实雷达、身体晃动和震动硬件测试仍需要对应环境与设备。</w:t>
+      </w:r>
+    </w:p>
+    <w:p>
+      <w:pPr>
+        <w:keepNext/>
+        <w:pageBreakBefore w:val="0"/>
+        <w:spacing w:after="100"/>
+        <w:jc w:val="left"/>
+      </w:pPr>
+      <w:r>
+        <w:rPr>
+          <w:rFonts w:ascii="Microsoft YaHei" w:hAnsi="Microsoft YaHei"/>
+          <w:color w:val="000000"/>
+          <w:sz w:val="20"/>
+        </w:rPr>
+        <w:t>2026年10月21日</w:t>
+        <w:br/>
+      </w:r>
+      <w:r>
+        <w:rPr>
+          <w:rFonts w:ascii="Microsoft YaHei" w:hAnsi="Microsoft YaHei" w:eastAsia="Microsoft YaHei"/>
+          <w:b/>
+          <w:color w:val="000000"/>
+          <w:sz w:val="24"/>
+        </w:rPr>
+        <w:t>先完成最简单的距离模拟</w:t>
+      </w:r>
+    </w:p>
+    <w:p>
+      <w:pPr>
+        <w:spacing w:after="100"/>
+      </w:pPr>
+      <w:r>
+        <w:t>我估计胸前雷达离地大约1.2至1.3米，但目前只是粗略估计，还没有精确测量。我也提出是否应该先考虑代码部分。继续比较后，我决定先做最简单的模拟版本，弄清楚计算和ROS通信原理；安装倾角与穿戴覆盖继续保留为后续问题，不把估计高度写死在程序里。</w:t>
+      </w:r>
+    </w:p>
+    <w:p>
+      <w:pPr>
+        <w:spacing w:after="100"/>
+      </w:pPr>
+      <w:r>
+        <w:t>这一步我只在既有点数节点里加入最近点距离计算，保留原来的点数和状态输出。模拟发布器仍然每秒发送四个点，坐标为(1,0,0)、(2,0,0)、(3,0,0)、(4,0,0)。它们位于模拟坐标系haptic_demo中，对应到原点的距离分别为1、2、3、4米，所以最小值是1米。</w:t>
+      </w:r>
+    </w:p>
+    <w:p>
+      <w:pPr>
+        <w:spacing w:after="100"/>
+      </w:pPr>
+      <w:r>
+        <w:t>每个点的三维距离等于sqrt(x*x+y*y+z*z)，代码使用math.hypot(x,y,z)计算，再用min选出最小值。坐标可以包含负数，但距离不为负。比如(3,4,0)的距离是5米，不能只拿x当距离。现在输出一直是1.0，并不是把答案写死，而是每帧收到的四个点都相同。</w:t>
+      </w:r>
+    </w:p>
+    <w:p>
+      <w:pPr>
+        <w:spacing w:after="100"/>
+      </w:pPr>
+      <w:r>
+        <w:t>代码位于~/haptic_ws/src/haptic_feedback/scripts/haptic_feedback_node.py。新增nearest_distance(points)函数和/haptic/nearest_distance发布器，消息类型是std_msgs/Float32，单位米。on_points回调收到CustomMsg后，先发布点数，再计算并发布距离。rostopic echo只是订阅结果并打印，不承担计算。输入仍通过原来的demo.launch切换到模拟话题。</w:t>
+      </w:r>
+    </w:p>
+    <w:p>
+      <w:pPr>
+        <w:spacing w:after="100"/>
+      </w:pPr>
+      <w:r>
+        <w:t>我给这个最小计算补了边界处理：非有限坐标不参与计算；空点云或没有有限坐标时输出NaN，表示未知，而不是输出0或表示没有障碍。原点零距离在数学演示中仍保留；真实Livox的返回标记、零值有效性、自身点、地面和噪声筛选还没有加入，所以这还不是实际避障算法。</w:t>
+      </w:r>
+    </w:p>
+    <w:p>
+      <w:pPr>
+        <w:spacing w:after="100"/>
+      </w:pPr>
+      <w:r>
+        <w:t>构建和语法检查通过，7项函数测试通过，覆盖四点最小值、三四五关系、三维距离、负坐标、空输入、非有限坐标和原点。在11323临时master上，集成测试连续收到点数4、4、4和距离1.0、1.0、1.0，话题类型正确，模拟图没有发布真实/livox/lidar。临时测试master已清理。</w:t>
+      </w:r>
+    </w:p>
+    <w:p>
+      <w:pPr>
+        <w:spacing w:after="100"/>
+      </w:pPr>
+      <w:r>
+        <w:t>之后我停止此前的模拟launch，在Jetson桌面重新启动demo.launch，以加载新代码，并打开持续执行rostopic echo /haptic/nearest_distance的结果终端。独立桌面检查又连续收到三次data: 1.0。去掉-n 1后，终端会继续订阅并滚动显示；按Ctrl+C停止查看，不会停止另一个终端的发布节点。</w:t>
+      </w:r>
+    </w:p>
+    <w:p>
+      <w:pPr>
+        <w:spacing w:after="100"/>
+      </w:pPr>
+      <w:r>
+        <w:t>本次没有修改模拟发布器、launch、雷达驱动、网络或Point-LIO，没有加入震动强度或马达控制。点到雷达原点的距离也不是点到身体表面的距离。下一步仍由我确定，不能把这次的简单最小值当成最终障碍选择方法。源码、测试、DISTANCE_DEMO.txt和公开日记继续同步到GitHub，保留真实提交日期。</w:t>
       </w:r>
     </w:p>
     <w:sectPr>

</xml_diff>

<commit_message>
Record real-sensor desktop test and unresolved input validity
</commit_message>
<xml_diff>
--- a/docs/research-diary.docx
+++ b/docs/research-diary.docx
@@ -1270,6 +1270,96 @@
       </w:pPr>
       <w:r>
         <w:t>本次没有修改模拟发布器、launch、雷达驱动、网络或Point-LIO，没有加入震动强度或马达控制。点到雷达原点的距离也不是点到身体表面的距离。下一步仍由我确定，不能把这次的简单最小值当成最终障碍选择方法。源码、测试、DISTANCE_DEMO.txt和公开日记继续同步到GitHub，保留真实提交日期。</w:t>
+      </w:r>
+    </w:p>
+    <w:p>
+      <w:pPr>
+        <w:keepNext/>
+        <w:pageBreakBefore w:val="0"/>
+        <w:spacing w:after="100"/>
+        <w:jc w:val="left"/>
+      </w:pPr>
+      <w:r>
+        <w:rPr>
+          <w:rFonts w:ascii="Microsoft YaHei" w:hAnsi="Microsoft YaHei"/>
+          <w:color w:val="000000"/>
+          <w:sz w:val="20"/>
+        </w:rPr>
+        <w:t>2026年10月21日</w:t>
+        <w:br/>
+      </w:r>
+      <w:r>
+        <w:rPr>
+          <w:rFonts w:ascii="Microsoft YaHei" w:hAnsi="Microsoft YaHei" w:eastAsia="Microsoft YaHei"/>
+          <w:b/>
+          <w:color w:val="000000"/>
+          <w:sz w:val="24"/>
+        </w:rPr>
+        <w:t>第一次真实雷达测试发现零坐标问题</w:t>
+      </w:r>
+    </w:p>
+    <w:p>
+      <w:pPr>
+        <w:spacing w:after="100"/>
+      </w:pPr>
+      <w:r>
+        <w:t>我把MID-360接上并通电后，希望开始初步测试。这次我确认雷达放在桌面上，并不是佩戴或手持行走。最开始检查时，网线虽然已连接，ROS里仍然只有先前的模拟节点，没有/livox/lidar。于是我把物理连接、网络准备、驱动启动和订阅计算分开检查，不把它们当成同一件事。</w:t>
+      </w:r>
+    </w:p>
+    <w:p>
+      <w:pPr>
+        <w:spacing w:after="100"/>
+      </w:pPr>
+      <w:r>
+        <w:t>我发现有线网卡缺少原雷达配置所需网段的主机地址，因此按既有启动流程临时补上地址。保留原来的网卡地址，没有修改Wi-Fi、持久网络配置或雷达IP。网络检查3次请求都有应答后，我单独启动原有livox_ros_driver2的msg_MID360.launch，没有启动Point-LIO。收到的第一帧属于livox_frame，有20,064点，消息类型是livox_ros_driver2/CustomMsg。</w:t>
+      </w:r>
+    </w:p>
+    <w:p>
+      <w:pPr>
+        <w:spacing w:after="100"/>
+      </w:pPr>
+      <w:r>
+        <w:t>确认真实点云到达后，我停止/haptic_demo_points和旧的/haptic_feedback_node，保留当前master，再通过bringup.launch启动既有计算节点。检查它确实订阅/livox/lidar，而且模拟话题不再发布。计算源码没有改变，因此这次能够直接观察模拟算法面对真实输入时会发生什么。</w:t>
+      </w:r>
+    </w:p>
+    <w:p>
+      <w:pPr>
+        <w:spacing w:after="100"/>
+      </w:pPr>
+      <w:r>
+        <w:t>我做了15秒观察，收到149帧点云，频率约9.996Hz，每帧19,872至20,064点，平均约20,000点。IMU收到3,011条，约200Hz。采样帧的声明点数与数组长度一致，非有限坐标计数为0，时间戳没有不递增现象，最大相邻时间间隔约0.10031秒。这只是短时观察，不能据此保证长期不丢包或不延迟。</w:t>
+      </w:r>
+    </w:p>
+    <w:p>
+      <w:pPr>
+        <w:spacing w:after="100"/>
+      </w:pPr>
+      <w:r>
+        <w:t>距离输出和点数输出各收到150条，但真实最小距离每次都是0米。我进一步统计发现，在2,980,032个输入点里，有1,215,601个坐标为(0,0,0)，约占40.79%。当前函数只排除NaN和Inf，零坐标仍是有限数，所以它们会被min选中。这说明程序的数学计算符合当前定义，但输入有效性还没有处理；不能把0米解释为真实障碍位于雷达原点。</w:t>
+      </w:r>
+    </w:p>
+    <w:p>
+      <w:pPr>
+        <w:spacing w:after="100"/>
+      </w:pPr>
+      <w:r>
+        <w:t>作为诊断，我另外统计了大于0的点的最小距离，约在0.0986至0.1024米之间。这没有替换节点输出，也不是筛选算法已经完成。查阅Livox官方产品说明后，我确认0.1至0.2米回波的精度不保证，仅供参考。因此即使删除零点，我也不能直接把约10cm当成可靠的障碍距离，更不能据此判断桌面或支架就是最近目标。零点的完整成因仍需核对，不能仅凭占比认定雷达损坏。</w:t>
+      </w:r>
+    </w:p>
+    <w:p>
+      <w:pPr>
+        <w:spacing w:after="100"/>
+      </w:pPr>
+      <w:r>
+        <w:t>这次我没有为了让结果好看而增加一个距离硬门限，也没有修改驱动、Point-LIO或最近距离函数。真实驱动、计算节点和持续查看窗口保持运行；之前的模拟发布器已经停止。我还没有摆放已测距离的目标或做受控移动，所以本次不能评价测距精度、误报漏报或提醒效果。下一步应先讨论并核对回波有效性、零坐标与自身点等问题，再进行有参照距离的测试。</w:t>
+      </w:r>
+    </w:p>
+    <w:p>
+      <w:pPr>
+        <w:spacing w:after="100"/>
+      </w:pPr>
+      <w:r>
+        <w:t>现场数字摘要和内部逐帧统计保存在~/haptic_ws/logs/20261021/real_baseline。公开仓库只同步REAL_BASELINE.txt、数字摘要、观察脚本和更新的第一人称日记，不上传内部网络输出、完整点云或逐帧CSV。官方近距限制参考：https://www.livoxtech.com/mid-360。</w:t>
       </w:r>
     </w:p>
     <w:sectPr>

</xml_diff>

<commit_message>
Record method review and dependency inventory without algorithm changes
</commit_message>
<xml_diff>
--- a/docs/research-diary.docx
+++ b/docs/research-diary.docx
@@ -1360,6 +1360,96 @@
       </w:pPr>
       <w:r>
         <w:t>现场数字摘要和内部逐帧统计保存在~/haptic_ws/logs/20261021/real_baseline。公开仓库只同步REAL_BASELINE.txt、数字摘要、观察脚本和更新的第一人称日记，不上传内部网络输出、完整点云或逐帧CSV。官方近距限制参考：https://www.livoxtech.com/mid-360。</w:t>
+      </w:r>
+    </w:p>
+    <w:p>
+      <w:pPr>
+        <w:keepNext/>
+        <w:pageBreakBefore w:val="0"/>
+        <w:spacing w:after="100"/>
+        <w:jc w:val="left"/>
+      </w:pPr>
+      <w:r>
+        <w:rPr>
+          <w:rFonts w:ascii="Microsoft YaHei" w:hAnsi="Microsoft YaHei"/>
+          <w:color w:val="000000"/>
+          <w:sz w:val="20"/>
+        </w:rPr>
+        <w:t>2026年10月21日</w:t>
+        <w:br/>
+      </w:r>
+      <w:r>
+        <w:rPr>
+          <w:rFonts w:ascii="Microsoft YaHei" w:hAnsi="Microsoft YaHei" w:eastAsia="Microsoft YaHei"/>
+          <w:b/>
+          <w:color w:val="000000"/>
+          <w:sz w:val="24"/>
+        </w:rPr>
+        <w:t>比较减少误判的方法与参考文献</w:t>
+      </w:r>
+    </w:p>
+    <w:p>
+      <w:pPr>
+        <w:spacing w:after="100"/>
+      </w:pPr>
+      <w:r>
+        <w:t>真实输入出现零坐标后，我希望继续思考怎样判断各个物体接近。我不要求一开始就非常准确，但至少想减少误判，也希望参考已有代码、方法或训练集，并在后面的研究说明中给出引用。这一轮先查资料和比较方案，没有直接改正在运行的节点。</w:t>
+      </w:r>
+    </w:p>
+    <w:p>
+      <w:pPr>
+        <w:spacing w:after="100"/>
+      </w:pPr>
+      <w:r>
+        <w:t>我先区分两个问题：判断前方有障碍，与认出它是人、椅子还是箱子。震动提醒首先需要前者，不必一开始就训练语义识别模型。查阅PCL官方教程、Open3D文档和DBSCAN原始论文后，我把几何处理列为优先候选：输入有效性、自身及前方区域、邻域支持或聚类、近表面距离，再结合短时确认和提醒迟滞。这是方案建议，尚未确定具体参数或实现。</w:t>
+      </w:r>
+    </w:p>
+    <w:p>
+      <w:pPr>
+        <w:spacing w:after="100"/>
+      </w:pPr>
+      <w:r>
+        <w:t>PCL的半径邻域过滤可以检查近点是否有其他点支持，欧氏聚类和DBSCAN可以把邻近点分组。但一个点团不一定对应一个完整物体；接触的物体可能合并，同一个物体也可能被分开。点少不一定是噪声，所以不能为了减少误报而把细杆和桌沿直接删掉。物体距离也不能只用点团中心表示，因为最近表面可能比中心近得多。</w:t>
+      </w:r>
+    </w:p>
+    <w:p>
+      <w:pPr>
+        <w:spacing w:after="100"/>
+      </w:pPr>
+      <w:r>
+        <w:t>我还注意到，时间确认会引入延迟；跨帧点云若不处理身体运动，可能出现拖影。若要判断同一个物体的接近速度，需要目标关联，不能把每帧不同的最近点直接相减。人走近固定墙面同样需要提醒，不必先证明墙在世界里运动。地面处理也不能简单删除最大的平面，必须考虑重力、安装姿态和位置。</w:t>
+      </w:r>
+    </w:p>
+    <w:p>
+      <w:pPr>
+        <w:spacing w:after="100"/>
+      </w:pPr>
+      <w:r>
+        <w:t>只读检查Jetson后，我确认已经安装PCL1.10.0及ROS-PCL1.7.4；当前Python可导入NumPy1.24.4和SciPy1.10.1，没有检测到Open3D与sklearn。系统包记录的SciPy与实际Python导入版本不同，后续应以运行环境验证为准。这次没有安装软件，也没有运行聚类或性能测试。PCL主要提供C++接口，不能因为系统有PCL就假定当前Python可以直接import pcl。</w:t>
+      </w:r>
+    </w:p>
+    <w:p>
+      <w:pPr>
+        <w:spacing w:after="100"/>
+      </w:pPr>
+      <w:r>
+        <w:t>训练集方面，我把S3DIS相关室内研究和SemanticKITTI作为进一步了解的候选。它们与胸前MID-360的扫描方式或使用场景不同，不能直接把公开模型的精度当成本装置效果。我更倾向先建立不训练的几何基线，用已测距离的物体、空背景、细物体和身体晃动场景比较误报、漏检和延迟，再决定是否需要语义模型。这个倾向还不是已经实现的方法。</w:t>
+      </w:r>
+    </w:p>
+    <w:p>
+      <w:pPr>
+        <w:spacing w:after="100"/>
+      </w:pPr>
+      <w:r>
+        <w:t>我整理了三篇候选文献：Rusu与Cousins的PCL论文（ICRA2011）、Ester等的DBSCAN论文（KDD1996）、Zhou等的Open3D论文（2018）。以后应按实际采用或比较的内容引用，不能把查阅写成已经使用，也不能把已有算法写成自己的原创。复制代码时还要保留对应版权与许可说明。完整来源链接、实现候选、风险和测试建议写进OBSTACLE_METHODS.txt，参考条目放在references.bib。</w:t>
+      </w:r>
+    </w:p>
+    <w:p>
+      <w:pPr>
+        <w:spacing w:after="100"/>
+      </w:pPr>
+      <w:r>
+        <w:t>这一轮没有修改零坐标处理、聚类、运动判断或马达控制，没有训练、下载数据或预训练权重，也没有得到误报减少的实验结果。之后仍由我选择下一步，不能把整套候选流程一次全部实施。研究说明和第一人称日记继续同步到公开仓库，内部登录与网络信息不公开。</w:t>
       </w:r>
     </w:p>
     <w:sectPr>

</xml_diff>

<commit_message>
Record PCL proximity prototype tests and remaining limitations
</commit_message>
<xml_diff>
--- a/docs/research-diary.docx
+++ b/docs/research-diary.docx
@@ -1450,6 +1450,112 @@
       </w:pPr>
       <w:r>
         <w:t>这一轮没有修改零坐标处理、聚类、运动判断或马达控制，没有训练、下载数据或预训练权重，也没有得到误报减少的实验结果。之后仍由我选择下一步，不能把整套候选流程一次全部实施。研究说明和第一人称日记继续同步到公开仓库，内部登录与网络信息不公开。</w:t>
+      </w:r>
+    </w:p>
+    <w:p>
+      <w:pPr>
+        <w:keepNext/>
+        <w:pageBreakBefore w:val="0"/>
+        <w:spacing w:after="100"/>
+        <w:jc w:val="left"/>
+      </w:pPr>
+      <w:r>
+        <w:rPr>
+          <w:rFonts w:ascii="Microsoft YaHei" w:hAnsi="Microsoft YaHei"/>
+          <w:color w:val="000000"/>
+          <w:sz w:val="20"/>
+        </w:rPr>
+        <w:t>2026年10月22日</w:t>
+        <w:br/>
+      </w:r>
+      <w:r>
+        <w:rPr>
+          <w:rFonts w:ascii="Microsoft YaHei" w:hAnsi="Microsoft YaHei" w:eastAsia="Microsoft YaHei"/>
+          <w:b/>
+          <w:color w:val="000000"/>
+          <w:sz w:val="24"/>
+        </w:rPr>
+        <w:t>实现PCL距离分档提醒并修正测试</w:t>
+      </w:r>
+    </w:p>
+    <w:p>
+      <w:pPr>
+        <w:spacing w:after="100"/>
+      </w:pPr>
+      <w:r>
+        <w:t>我决定先按距离提醒，不要求判断物体本身是否运动。我走近固定墙面时也需要提醒，因此第一版不做语义分类或目标速度估计，只做点云候选距离和软件提醒等级。</w:t>
+      </w:r>
+    </w:p>
+    <w:p>
+      <w:pPr>
+        <w:spacing w:after="100"/>
+      </w:pPr>
+      <w:r>
+        <w:t>我在独立的~/haptic_ws/src/haptic_feedback中增加src/pcl_proximity_node.cpp和launch/pcl_proximity.launch，并扩展该包的CMakeLists.txt及package.xml依赖。原来的Python演示保留，没有修改Point-LIO、Livox驱动、建图launch、桌面备忘或原始bag，也没有安装新系统软件。</w:t>
+      </w:r>
+    </w:p>
+    <w:p>
+      <w:pPr>
+        <w:spacing w:after="100"/>
+      </w:pPr>
+      <w:r>
+        <w:t>每帧先排除非有限坐标及零坐标，将小于0.2米的点另记为近场不确定，再对0.2至5米候选使用PCL RadiusOutlierRemoval。邻域半径暂定0.08米，最少邻点参数为3。保留点中的最近距离用于分档：不超过0.5米为强，不超过1米为中，不超过2米为弱。更远的候选不触发近距提醒，但不能解释为安全。这些都是可修改的演示参数，不是安全标准。</w:t>
+      </w:r>
+    </w:p>
+    <w:p>
+      <w:pPr>
+        <w:spacing w:after="100"/>
+      </w:pPr>
+      <w:r>
+        <w:t>我加入0.1米释放迟滞和连续2帧释放确认，以减少阈值附近反复切换；增强提醒立即响应。超过0.5秒未收到输入时，输出NaN距离、等级255和STALE_OR_NO_DATA。近场不确定标志不会因为同时找到其他候选而被抹掉。目前没有检查历史时间戳新鲜度，也没有身体、地面、方向或tag筛选，细杆等稀疏目标可能被邻域过滤删去，尚不能用作安全避障设备。</w:t>
+      </w:r>
+    </w:p>
+    <w:p>
+      <w:pPr>
+        <w:spacing w:after="100"/>
+      </w:pPr>
+      <w:r>
+        <w:t>10月21日编译成功但自动测试失败。10月22日我检查发现，测试用输入header.seq匹配输出，而ROS发布器会自动更新该序号。我只将测试关联标识改为带用例编号的frame_id，没有为通过测试而更改距离算法。重测13种模拟输入全部通过，另验证启动缺数据、断流、恢复以及非法参数退出，并确认隔离测试master已停止。模拟测试不代表真实测距精度或误报降低。</w:t>
+      </w:r>
+    </w:p>
+    <w:p>
+      <w:pPr>
+        <w:spacing w:after="100"/>
+      </w:pPr>
+      <w:r>
+        <w:t>实际链接仍同时含Boost filesystem 1.83和1.71，存在版本混用风险；本次测试通过不能消除该风险。我没有改动系统库。接入真实雷达前还需观察长期稳定性和计算负载。</w:t>
+      </w:r>
+    </w:p>
+    <w:p>
+      <w:pPr>
+        <w:spacing w:after="100"/>
+      </w:pPr>
+      <w:r>
+        <w:t>现场再次检查时默认ROS master已经停止。我单独在Jetson桌面打开roslaunch haptic_feedback pcl_proximity.launch，实读状态为STALE_OR_NO_DATA，节点为haptic_proximity_node和rosout，没有启动驱动或建图。当前真实雷达与已知距离目标对照未完成，没有连接或控制马达。</w:t>
+      </w:r>
+    </w:p>
+    <w:p>
+      <w:pPr>
+        <w:spacing w:after="100"/>
+      </w:pPr>
+      <w:r>
+        <w:t>运行新版需要先source ~/haptic_ws/devel/setup.bash。结果在/haptic/proximity/distance、/haptic/proximity/level、/haptic/proximity/state和/haptic/proximity/diagnostics。等级0是没有近距候选，1至3是软件提醒分档，255是未知，不能直接当作电机PWM。</w:t>
+      </w:r>
+    </w:p>
+    <w:p>
+      <w:pPr>
+        <w:spacing w:after="100"/>
+      </w:pPr>
+      <w:r>
+        <w:t>同日我还初查过同学反馈的扫描中断与复制失败：内置盘空间充足，最新一份bag只含摄像头，USB存储存在断开记录，但未拿到准确错误，不能确定原因。我随后暂停这项排查，按当前开发方向继续；没有修复、删除或格式化原数据。</w:t>
+      </w:r>
+    </w:p>
+    <w:p>
+      <w:pPr>
+        <w:spacing w:after="100"/>
+      </w:pPr>
+      <w:r>
+        <w:t>本次源码、测试和公开日记副本已经在本地整理，GitHub尚未同步，不能把本地版本当作已经上传。下一步是接入真实雷达，用已测距离目标进行桌面验证；在此之前不声称提醒效果可靠。</w:t>
       </w:r>
     </w:p>
     <w:sectPr>

</xml_diff>

<commit_message>
Record real stationary observations and experiment-first evaluation plan
</commit_message>
<xml_diff>
--- a/docs/research-diary.docx
+++ b/docs/research-diary.docx
@@ -1556,6 +1556,112 @@
       </w:pPr>
       <w:r>
         <w:t>本次源码、测试和公开日记副本已经在本地整理，GitHub尚未同步，不能把本地版本当作已经上传。下一步是接入真实雷达，用已测距离目标进行桌面验证；在此之前不声称提醒效果可靠。</w:t>
+      </w:r>
+    </w:p>
+    <w:p>
+      <w:pPr>
+        <w:keepNext/>
+        <w:pageBreakBefore w:val="0"/>
+        <w:spacing w:after="100"/>
+        <w:jc w:val="left"/>
+      </w:pPr>
+      <w:r>
+        <w:rPr>
+          <w:rFonts w:ascii="Microsoft YaHei" w:hAnsi="Microsoft YaHei"/>
+          <w:color w:val="000000"/>
+          <w:sz w:val="20"/>
+        </w:rPr>
+        <w:t>2026年10月22日</w:t>
+        <w:br/>
+      </w:r>
+      <w:r>
+        <w:rPr>
+          <w:rFonts w:ascii="Microsoft YaHei" w:hAnsi="Microsoft YaHei" w:eastAsia="Microsoft YaHei"/>
+          <w:b/>
+          <w:color w:val="000000"/>
+          <w:sz w:val="24"/>
+        </w:rPr>
+        <w:t>真实桌面观察与先实验后开发的安排</w:t>
+      </w:r>
+    </w:p>
+    <w:p>
+      <w:pPr>
+        <w:spacing w:after="100"/>
+      </w:pPr>
+      <w:r>
+        <w:t>我接入真实雷达后，先检查点云是否到达距离节点。当时驱动没有运行，有线口也缺少既有雷达网段。我临时补回原来所需的辅助网段，保留原地址，三次连通性检查成功，再启动现成的msg_MID360.launch。这没有修改永久网络、雷达IP、Point-LIO或驱动源码，也没有启动建图或马达。</w:t>
+      </w:r>
+    </w:p>
+    <w:p>
+      <w:pPr>
+        <w:spacing w:after="100"/>
+      </w:pPr>
+      <w:r>
+        <w:t>我确认第一次雷达放在狭窄桌面，完全没有动。15秒收到150条，约10Hz，全部为STRONG;NEAR_FIELD_UNCERTAIN；候选距离0.200002至0.204443米，均值0.200720米；每帧处理平均29.123毫秒、最大33.512毫秒。第二次放到较开阔位置，但约25厘米处仍有风扇；15秒151条，候选0.200012至0.203443米，均值0.200592米，处理平均35.856毫秒、最大44.215毫秒，提醒状态不变。</w:t>
+      </w:r>
+    </w:p>
+    <w:p>
+      <w:pPr>
+        <w:spacing w:after="100"/>
+      </w:pPr>
+      <w:r>
+        <w:t>第三次我移动后描述距离约1米，同时朝向改变了一些；具体改变哪个对象的朝向尚未明确，距离也没有尺量，不能当成只改变风扇距离的对照。15秒150条，候选0.200005至0.203226米，均值0.200527米，处理平均34.839毫秒、最大41.568毫秒，仍全部为强提醒加近场不确定。三次都贴近0.2米候选下界，不能把这个输出直接当成风扇距离或计算测距误差。</w:t>
+      </w:r>
+    </w:p>
+    <w:p>
+      <w:pPr>
+        <w:spacing w:after="100"/>
+      </w:pPr>
+      <w:r>
+        <w:t>我提出近点可能来自雷达附近的细线缆。这是一个待验证假设，不是已定位的结果。PCL邻域过滤只看附近有多少点，并不识别物体身份；近处线缆也可能有足够点支持，而细杆等真实障碍也可能因点少而被删。我不打算简单删除所有细小物体，或提高最小距离来隐藏问题。</w:t>
+      </w:r>
+    </w:p>
+    <w:p>
+      <w:pPr>
+        <w:spacing w:after="100"/>
+      </w:pPr>
+      <w:r>
+        <w:t>我希望先设计实验，再按实验需要开发软件。计划先做静止线缆对照：固定雷达、支架、朝向、环境和算法参数，记录原布线20秒；仅在断电或安全整理条件下将可移动线缆固定到不遮挡扫描区域的位置，重新稳定启动后记录20秒，必要时恢复原布线确认重复性。不能拔掉必要的供电或网络线，不能拉扯接口。暂不能移动的部件先拍照记录。前后有重启时要记录并待启动稳定，不能把启动差异混为线缆效应。每种布线建议重复3次；以上均尚未实施。</w:t>
+      </w:r>
+    </w:p>
+    <w:p>
+      <w:pPr>
+        <w:spacing w:after="100"/>
+      </w:pPr>
+      <w:r>
+        <w:t>之后再做已知距离测试：先确定雷达坐标与装置前方的对应关系，目标高度进入实际视场。在固定装置前方用大纸箱或平板，量取约2.5、1.5、0.8、0.4米，每档静止20秒，每档重复3次，顺序交替，并留无目标背景片段。距离从记录好的雷达参考位置到目标近表面测量；若声称厘米级误差，还需要核对厂家测距参考中心和尺量不确定度。距离点先避开分档边界。需保留细杆或桌腿作为额外漏检对照；不能以滤掉线缆为理由滤掉所有细物体。这些是计划，不是已经通过的测试。</w:t>
+      </w:r>
+    </w:p>
+    <w:p>
+      <w:pPr>
+        <w:spacing w:after="100"/>
+      </w:pPr>
+      <w:r>
+        <w:t>静止问题解释清楚后，计划在平地上睁眼佩戴、由同学陪同，以正常使用姿态沿约5至10米的清空通道缓慢接近固定墙面或箱子，在不接触目标的标记处停下并退回，重复3次，单次约1至2分钟；没有楼梯或蒙眼行走，不依赖原型避障。胸前高度和倾角要实测记录。最终研究室路线可在这些测试稳定后增加，目前不先绕楼或上下楼。</w:t>
+      </w:r>
+    </w:p>
+    <w:p>
+      <w:pPr>
+        <w:spacing w:after="100"/>
+      </w:pPr>
+      <w:r>
+        <w:t>采集计划保留原始/livox/lidar、/livox/imu及/haptic/proximity/diagnostics，并记录参数、版本、安装照片、试次、目标与尺量距离。摄像头可选，需要能把动作和bag时间对应起来，并避免无关人员入镜；不默认录大体积原始图像。原始bag留本地，不公开上传。每次正常Ctrl+C结束并确认话题和文件可读；目前还没有为这套计划新录bag或制作采集工具。</w:t>
+      </w:r>
+    </w:p>
+    <w:p>
+      <w:pPr>
+        <w:spacing w:after="100"/>
+      </w:pPr>
+      <w:r>
+        <w:t>我准备先按原始数据诊断近点位置，再按实际安装几何考虑自身遮挡范围、前方区域与时间处理。身体或线缆屏蔽区域必须由安装和对照支持，不能直接整圈删除某个距离内的点。新增版本应使用同一份数据比较原版和新版，再保留另一组新采数据作独立检查。评价包括已知目标段是否提醒、误报次数或持续时间、漏检试次、输出延迟和处理耗时；连续帧不是独立重复实验，脚步轨迹估计也不当作精确真值。更改后不能只展示好看的片段。</w:t>
+      </w:r>
+    </w:p>
+    <w:p>
+      <w:pPr>
+        <w:spacing w:after="100"/>
+      </w:pPr>
+      <w:r>
+        <w:t>当前只完成三次真实桌面观察和实验安排，没有新增过滤算法、身体坐标、采集软件或穿戴试验。接下来先拍装置侧面与上方照片，确认线缆相对扫描区域的位置，以及是否能不移动雷达而安全整理线缆，再选择第一组实验。MID-360近距限制和PCL邻域过滤依据再次查阅官方说明；本轮方案不把它们当作已验证的产品安全标准。</w:t>
       </w:r>
     </w:p>
     <w:sectPr>

</xml_diff>

<commit_message>
Require startup self-filtering for chest-mounted bracket and cables
</commit_message>
<xml_diff>
--- a/docs/research-diary.docx
+++ b/docs/research-diary.docx
@@ -1662,6 +1662,72 @@
       </w:pPr>
       <w:r>
         <w:t>当前只完成三次真实桌面观察和实验安排，没有新增过滤算法、身体坐标、采集软件或穿戴试验。接下来先拍装置侧面与上方照片，确认线缆相对扫描区域的位置，以及是否能不移动雷达而安全整理线缆，再选择第一组实验。MID-360近距限制和PCL邻域过滤依据再次查阅官方说明；本轮方案不把它们当作已验证的产品安全标准。</w:t>
+      </w:r>
+    </w:p>
+    <w:p>
+      <w:pPr>
+        <w:keepNext/>
+        <w:pageBreakBefore w:val="0"/>
+        <w:spacing w:after="100"/>
+        <w:jc w:val="left"/>
+      </w:pPr>
+      <w:r>
+        <w:rPr>
+          <w:rFonts w:ascii="Microsoft YaHei" w:hAnsi="Microsoft YaHei"/>
+          <w:color w:val="000000"/>
+          <w:sz w:val="20"/>
+        </w:rPr>
+        <w:t>2026年10月22日</w:t>
+        <w:br/>
+      </w:r>
+      <w:r>
+        <w:rPr>
+          <w:rFonts w:ascii="Microsoft YaHei" w:hAnsi="Microsoft YaHei" w:eastAsia="Microsoft YaHei"/>
+          <w:b/>
+          <w:color w:val="000000"/>
+          <w:sz w:val="24"/>
+        </w:rPr>
+        <w:t>明确胸前装置的自身过滤要求</w:t>
+      </w:r>
+    </w:p>
+    <w:p>
+      <w:pPr>
+        <w:spacing w:after="100"/>
+      </w:pPr>
+      <w:r>
+        <w:t>我说明装置已放好，并补充近点不一定只是线缆，也可能是整个支架。胸前佩戴时，这些结构会长期出现在雷达视场里，所以不能一直把它们当作需要提醒的外部障碍。自身过滤应成为启动时就准备好的必要步骤，而不是只要求把设备周围清空。支架是否确为当前20厘米候选来源仍未验证。</w:t>
+      </w:r>
+    </w:p>
+    <w:p>
+      <w:pPr>
+        <w:spacing w:after="100"/>
+      </w:pPr>
+      <w:r>
+        <w:t>我把下一阶段目标明确为装置自身过滤：在雷达局部坐标中，为已经确认的支架和固定线缆建立几何屏蔽范围，保存为安装配置，每次启动加载，在邻域过滤和障碍距离判断前排除这些点。刚性固定结构在局部坐标中随雷达一起运动，不需要按研究室世界坐标设置；线缆摆动、安装变化和胸前衣物不一定刚性固定，需要单独验证范围，不能直接假定一次标定永久适用。</w:t>
+      </w:r>
+    </w:p>
+    <w:p>
+      <w:pPr>
+        <w:spacing w:after="100"/>
+      </w:pPr>
+      <w:r>
+        <w:t>我查阅PCL CropBox官方接口，确认可以按给定三维盒范围并反向保留盒外点，作为几何自身过滤候选。盒子尺寸、个数、朝向与余量还未测定，不能现在凭20厘米距离猜一个屏蔽半径。启动时应加载经过确认的自身区域，不应把启动时看到的所有静止近物自动学成自身，否则墙面、桌子或贴近身体的物体也可能被永久忽略。</w:t>
+      </w:r>
+    </w:p>
+    <w:p>
+      <w:pPr>
+        <w:spacing w:after="100"/>
+      </w:pPr>
+      <w:r>
+        <w:t>自身点不应继续触发外部障碍的强提醒，但结构挡住的后方仍是不可观测区域，不能因为删掉点就宣称那里安全。我打算保留原始输入，分别显示屏蔽范围、被排除点和剩余候选，记录屏蔽状态及数量，方便复查。本功能先只作用于新提醒节点，保持原始雷达话题和Point-LIO输入不变。以上为需求和设计方向，尚未写入或启用过滤代码。</w:t>
+      </w:r>
+    </w:p>
+    <w:p>
+      <w:pPr>
+        <w:spacing w:after="100"/>
+      </w:pPr>
+      <w:r>
+        <w:t>接下来先提供装置侧面和上方照片，标出佩戴时朝前方向，结合安装尺寸与近点分布确认自身区域。照片不能单独给出准确三维边界，必要时还要尺量或在点云中确认。现阶段不再要求为了获得较大距离数值反复搬动风扇；仍保留已知外部物体对照，以检查屏蔽是否误删真实障碍。本轮没有连接或修改Jetson，没有新采集、软件测试或过滤效果结论。参考：https://pointclouds.org/documentation/classpcl_1_1_crop_box.html。</w:t>
       </w:r>
     </w:p>
     <w:sectPr>

</xml_diff>

<commit_message>
Record software-first cloud analysis and verified local filtering
</commit_message>
<xml_diff>
--- a/docs/research-diary.docx
+++ b/docs/research-diary.docx
@@ -1728,6 +1728,112 @@
       </w:pPr>
       <w:r>
         <w:t>接下来先提供装置侧面和上方照片，标出佩戴时朝前方向，结合安装尺寸与近点分布确认自身区域。照片不能单独给出准确三维边界，必要时还要尺量或在点云中确认。现阶段不再要求为了获得较大距离数值反复搬动风扇；仍保留已知外部物体对照，以检查屏蔽是否误删真实障碍。本轮没有连接或修改Jetson，没有新采集、软件测试或过滤效果结论。参考：https://pointclouds.org/documentation/classpcl_1_1_crop_box.html。</w:t>
+      </w:r>
+    </w:p>
+    <w:p>
+      <w:pPr>
+        <w:keepNext/>
+        <w:pageBreakBefore w:val="0"/>
+        <w:spacing w:after="100"/>
+        <w:jc w:val="left"/>
+      </w:pPr>
+      <w:r>
+        <w:rPr>
+          <w:rFonts w:ascii="Microsoft YaHei" w:hAnsi="Microsoft YaHei"/>
+          <w:color w:val="000000"/>
+          <w:sz w:val="20"/>
+        </w:rPr>
+        <w:t>2026年10月22日</w:t>
+        <w:br/>
+      </w:r>
+      <w:r>
+        <w:rPr>
+          <w:rFonts w:ascii="Microsoft YaHei" w:hAnsi="Microsoft YaHei" w:eastAsia="Microsoft YaHei"/>
+          <w:b/>
+          <w:color w:val="000000"/>
+          <w:sz w:val="24"/>
+        </w:rPr>
+        <w:t>不依赖机械原型先保存点云开发过滤软件</w:t>
+      </w:r>
+    </w:p>
+    <w:p>
+      <w:pPr>
+        <w:spacing w:after="100"/>
+      </w:pPr>
+      <w:r>
+        <w:t>我进一步说明，可穿戴机械原型还没有制作好，现在希望先完成软件。当前环境较空，雷达保持静止，可以直接保存点云再分析，不应一直把拍支架照片作为继续开发的条件。我因此将工作顺序改成保存原始数据、检查分布、用相同数据重算过滤效果；照片只是可选辅助，不是软件开发前置条件。</w:t>
+      </w:r>
+    </w:p>
+    <w:p>
+      <w:pPr>
+        <w:spacing w:after="100"/>
+      </w:pPr>
+      <w:r>
+        <w:t>检查时驱动与ROS master均已停止。我恢复既有临时辅助网段并重开真实驱动和距离节点，没有改永久网络、雷达IP、Point-LIO、摄像头或桌面备忘。随后加入scripts/capture_near_cloud.py，以独立rosbag录制进程保存点云、IMU和诊断；缓冲128MB、正常SIGINT收尾，每次生成新目录，不覆盖原始包。本次请求15秒录制窗口，实际141帧点云的header跨度约14秒，另有2835条IMU与142条诊断，原包约53MiB。</w:t>
+      </w:r>
+    </w:p>
+    <w:p>
+      <w:pPr>
+        <w:spacing w:after="100"/>
+      </w:pPr>
+      <w:r>
+        <w:t>原始文件为~/bags/haptic/cloud_20261022_184739_914190/raw.bag。我同时导出最后一帧有效XYZ的PCD、50厘米内非零近点PCD和NPZ、2厘米体素的逐帧出现比例CSV及JSON统计。首段共有282万个点，零坐标280506个；50厘米内有效非零近点70031个，均在雷达X负方向，X约-0.299至-0.072米，Z约-0.039至0.057米。这是雷达坐标，尚未对应身体前后，不能仅由静止性认定是支架。</w:t>
+      </w:r>
+    </w:p>
+    <w:p>
+      <w:pPr>
+        <w:spacing w:after="100"/>
+      </w:pPr>
+      <w:r>
+        <w:t>这次点云说明，近点集中在局部而不是环绕雷达，因此可以做局部几何过滤试验。我按所观察近点的包围范围加2厘米余量生成candidate_mask.yaml，默认关闭，并明确标记自身身份未确认。这里的50厘米和2厘米是分析及试验设置，不是正式身体尺寸或安全阈值；候选盒也可能覆盖真实外物或盒内空白区域。</w:t>
+      </w:r>
+    </w:p>
+    <w:p>
+      <w:pPr>
+        <w:spacing w:after="100"/>
+      </w:pPr>
+      <w:r>
+        <w:t>我在现有C++节点加入PCL CropBox局部过滤，位于范围筛选和邻域支持之前；新增config/self_mask.yaml，launch支持self_mask_config启动参数。配置可设置多个三维盒及输入坐标系，默认关闭且无盒。诊断增加过滤开关、盒数量和被排除点数；坐标系不符时输出UNKNOWN，不按错误坐标屏蔽；启用但空配置、边界错误等会拒绝启动。原始/livox/lidar与建图输入未改变。</w:t>
+      </w:r>
+    </w:p>
+    <w:p>
+      <w:pPr>
+        <w:spacing w:after="100"/>
+      </w:pPr>
+      <w:r>
+        <w:t>重新编译后，旧13项模拟用例仍通过，新7项几何过滤用例也通过，包含自身点与外点、边界、重叠盒去重、近场不确定、坐标系不符及恢复，另验证空或非法配置退出。11324和11325隔离测试master均清理。随后用11326隔离master重放原始点云，对同一份141帧数据试启用候选盒，输出全部MEDIUM，距离0.905349至0.966950米，平均0.949241米；每帧平均排除约497点。原包记录的基线是142条强提醒加近场不确定，距离0.200012至0.203580米。</w:t>
+      </w:r>
+    </w:p>
+    <w:p>
+      <w:pPr>
+        <w:spacing w:after="100"/>
+      </w:pPr>
+      <w:r>
+        <w:t>这证明局部过滤代码及重算流程能工作，不证明近点一定属于支架，也不证明约0.95米的剩余点就是风扇。候选盒来自本段数据，因此这不是独立测试集上的精度或误报评价。后续仍要保留未用于拟合的新数据检查误删和漏检。没有依据将所有启动时静止物都学习为自身，也没有删除所有近点或所有细物体。</w:t>
+      </w:r>
+    </w:p>
+    <w:p>
+      <w:pPr>
+        <w:spacing w:after="100"/>
+      </w:pPr>
+      <w:r>
+        <w:t>本地绘图环境没有Matplotlib，第一次绘图失败；我没有安装额外软件，改用已有Pillow从数值数组生成XY、XZ与距离分布图，检查并修正标题和坐标文字重叠。原始点云、PCD、NPZ、CSV、候选场景配置与分析图只存本地，不上传公开仓库；公开代码、测试和说明与经核对的日记副本同步。</w:t>
+      </w:r>
+    </w:p>
+    <w:p>
+      <w:pPr>
+        <w:spacing w:after="100"/>
+      </w:pPr>
+      <w:r>
+        <w:t>新版采样命令为source ~/haptic_ws/devel/setup.bash后执行rosrun haptic_feedback capture_near_cloud.py --seconds 15。另用--bag可分析已有包，生成新目录。新版自动保存参数与源文件哈希；哈希不等于运行二进制版本的完整证明。我又用2秒请求做实际命令冒烟测试，正常保存12帧点云及相关话题，确保rosrun入口可用。</w:t>
+      </w:r>
+    </w:p>
+    <w:p>
+      <w:pPr>
+        <w:spacing w:after="100"/>
+      </w:pPr>
+      <w:r>
+        <w:t>结束时真实驱动与更新后的距离节点继续运行，现场默认屏蔽仍关闭，诊断self_mask_enabled=false与self_masked_points=0。候选配置只在隔离回放试验启用，隔离master已停止；没有私自将未确认场景盒作为正式穿戴标定。没有马达、建图、相机或新系统软件安装。原有Boost1.71与1.83混用警告仍存在，不能因这些测试通过就宣称长期稳定性或安全性已解决。下一步可继续以已保存点云做软件对照，不再等待机械原型或照片。</w:t>
       </w:r>
     </w:p>
     <w:sectPr>

</xml_diff>

<commit_message>
Record bounded offline software continuation and verified private backup
</commit_message>
<xml_diff>
--- a/docs/research-diary.docx
+++ b/docs/research-diary.docx
@@ -1834,6 +1834,64 @@
       </w:pPr>
       <w:r>
         <w:t>结束时真实驱动与更新后的距离节点继续运行，现场默认屏蔽仍关闭，诊断self_mask_enabled=false与self_masked_points=0。候选配置只在隔离回放试验启用，隔离master已停止；没有私自将未确认场景盒作为正式穿戴标定。没有马达、建图、相机或新系统软件安装。原有Boost1.71与1.83混用警告仍存在，不能因这些测试通过就宣称长期稳定性或安全性已解决。下一步可继续以已保存点云做软件对照，不再等待机械原型或照片。</w:t>
+      </w:r>
+    </w:p>
+    <w:p>
+      <w:pPr>
+        <w:keepNext/>
+        <w:pageBreakBefore w:val="0"/>
+        <w:spacing w:after="100"/>
+        <w:jc w:val="left"/>
+      </w:pPr>
+      <w:r>
+        <w:rPr>
+          <w:rFonts w:ascii="Microsoft YaHei" w:hAnsi="Microsoft YaHei"/>
+          <w:color w:val="000000"/>
+          <w:sz w:val="20"/>
+        </w:rPr>
+        <w:t>2026年10月22日</w:t>
+        <w:br/>
+      </w:r>
+      <w:r>
+        <w:rPr>
+          <w:rFonts w:ascii="Microsoft YaHei" w:hAnsi="Microsoft YaHei" w:eastAsia="Microsoft YaHei"/>
+          <w:b/>
+          <w:color w:val="000000"/>
+          <w:sz w:val="24"/>
+        </w:rPr>
+        <w:t>安排关闭雷达后的离线软件续做</w:t>
+      </w:r>
+    </w:p>
+    <w:p>
+      <w:pPr>
+        <w:spacing w:after="100"/>
+      </w:pPr>
+      <w:r>
+        <w:t>我准备回家并关闭雷达，但保持Jetson开机，希望软件研究和开发能继续逐步推进，明天再检查。我将这段时间的范围限定为保存点云的离线分析、新haptic软件的小步修改、测试与说明，不继续现场采集，也不改变建图、驱动、网络、系统库或默认屏蔽行为。今晚允许在这个范围内自主推进，不需要每项都等我现场操作，新的决定仍以之后的消息为准。</w:t>
+      </w:r>
+    </w:p>
+    <w:p>
+      <w:pPr>
+        <w:spacing w:after="100"/>
+      </w:pPr>
+      <w:r>
+        <w:t>为避免远程连接影响全部研究，我把今天约53MiB的完整raw.bag备份到本机work/cloud_software_20261022/private_cloud/raw.bag。文件大小54806563字节，SHA256与Jetson原包相同。原始数据、场景配置和点云图继续保持本地，不上传公开仓库；筛选后的代码、思考、测试说明和持续日记可以同步GitHub，提交使用实际时间。</w:t>
+      </w:r>
+    </w:p>
+    <w:p>
+      <w:pPr>
+        <w:spacing w:after="100"/>
+      </w:pPr>
+      <w:r>
+        <w:t>我安排本对话每小时续做一个小步骤，暂以2026年10月23日日本时间上午9点为本轮结束界限。优先审核录包与回放边界、补充过滤误删测试、制作可复现离线比较报告、明确候选屏蔽状态，再准备明天的检查说明。有限清单完成就收尾，不为增加提交而做无关改动。当前完成的是计划、备份和定时安排，不能提前把夜间新研究写成已经完成。</w:t>
+      </w:r>
+    </w:p>
+    <w:p>
+      <w:pPr>
+        <w:spacing w:after="100"/>
+      </w:pPr>
+      <w:r>
+        <w:t>本地续做要求运行应用的Windows电脑也保持开机、联网、应用开启和不休眠，只保持Jetson在线不能保证定时任务运行。我没有擅自修改电源设置。若Jetson不可用，先继续能在本机完成的工作；需要ROS或PCL实跑却无法验证的部分标为未验证。若登录或上传受阻，保留待同步内容并如实报告，不宣称已经上传。</w:t>
       </w:r>
     </w:p>
     <w:sectPr>

</xml_diff>

<commit_message>
Log verified offline capture consistency checks
</commit_message>
<xml_diff>
--- a/docs/research-diary.docx
+++ b/docs/research-diary.docx
@@ -1892,6 +1892,64 @@
       </w:pPr>
       <w:r>
         <w:t>本地续做要求运行应用的Windows电脑也保持开机、联网、应用开启和不休眠，只保持Jetson在线不能保证定时任务运行。我没有擅自修改电源设置。若Jetson不可用，先继续能在本机完成的工作；需要ROS或PCL实跑却无法验证的部分标为未验证。若登录或上传受阻，保留待同步内容并如实报告，不宣称已经上传。</w:t>
+      </w:r>
+    </w:p>
+    <w:p>
+      <w:pPr>
+        <w:keepNext/>
+        <w:pageBreakBefore w:val="0"/>
+        <w:spacing w:after="100"/>
+        <w:jc w:val="left"/>
+      </w:pPr>
+      <w:r>
+        <w:rPr>
+          <w:rFonts w:ascii="Microsoft YaHei" w:hAnsi="Microsoft YaHei"/>
+          <w:color w:val="000000"/>
+          <w:sz w:val="20"/>
+        </w:rPr>
+        <w:t>2026年10月22日</w:t>
+        <w:br/>
+      </w:r>
+      <w:r>
+        <w:rPr>
+          <w:rFonts w:ascii="Microsoft YaHei" w:hAnsi="Microsoft YaHei" w:eastAsia="Microsoft YaHei"/>
+          <w:b/>
+          <w:color w:val="000000"/>
+          <w:sz w:val="24"/>
+        </w:rPr>
+        <w:t>夜间第一步检查采样数据一致性</w:t>
+      </w:r>
+    </w:p>
+    <w:p>
+      <w:pPr>
+        <w:spacing w:after="100"/>
+      </w:pPr>
+      <w:r>
+        <w:t>雷达关闭后的第一步，我先审核已有点云采样与分析代码，而不是继续调整提醒距离。我发现原来只要有近点且坐标系种类为一种，就会生成候选盒；这没有排除空坐标系名、重复或倒退的时间戳、声明点数不符等情况。虽然候选默认关闭，但这种数据不应继续用于生成局部屏蔽范围。</w:t>
+      </w:r>
+    </w:p>
+    <w:p>
+      <w:pPr>
+        <w:spacing w:after="100"/>
+      </w:pPr>
+      <w:r>
+        <w:t>我仅修改scripts/capture_near_cloud.py，增加数据质量报告，统计非正或非有限时间戳、时间不递增次数、点数声明不符帧数，以及相邻header时间间隔。坐标系混合或为空、时间异常、点数不符或没有有效近点时，不再生成candidate_mask.yaml；仍导出诊断点云和统计供检查。NPZ增加逐帧坐标系名，避免只存汇总名称而丢失对应关系。这是离线一致性检查，不代表已验证消息新鲜度或自身结构身份，也不修改实时障碍判断。</w:t>
+      </w:r>
+    </w:p>
+    <w:p>
+      <w:pPr>
+        <w:spacing w:after="100"/>
+      </w:pPr>
+      <w:r>
+        <w:t>我补充test_capture_analysis.py共13项模拟bag单元测试，覆盖干净数据、空点云、零点、非有限坐标、混合或空坐标系、零/非有限/重复/倒退时间戳、声明点数不符、缺雷达话题和体素按帧而非按点计数。Windows本机及Jetson均13项通过。测试使用人工构造消息，不能把它们当成真实场景测距或误报效果。</w:t>
+      </w:r>
+    </w:p>
+    <w:p>
+      <w:pPr>
+        <w:spacing w:after="100"/>
+      </w:pPr>
+      <w:r>
+        <w:t>我还在Jetson上只读取已经保存的141帧raw.bag重做分析，没有打开雷达、录制新包或启动驱动/建图。结果是时间异常0、点数不符0、相邻header间隔最小约0.097838秒、中位约0.099963秒、最大约0.101986秒；70031个近点和原诊断状态统计保持不变。新分析输出在单独目录，不覆盖原包。实时默认屏蔽、C++检测节点、网络和系统库均未改变。下一步继续检查回放流程和屏蔽误删，不把这次一致性通过称作独立场景或穿戴安全验证。</w:t>
       </w:r>
     </w:p>
     <w:sectPr>

</xml_diff>

<commit_message>
Record verified replay boundary checks and TIME_WAIT fix
</commit_message>
<xml_diff>
--- a/docs/research-diary.docx
+++ b/docs/research-diary.docx
@@ -1950,6 +1950,80 @@
       </w:pPr>
       <w:r>
         <w:t>我还在Jetson上只读取已经保存的141帧raw.bag重做分析，没有打开雷达、录制新包或启动驱动/建图。结果是时间异常0、点数不符0、相邻header间隔最小约0.097838秒、中位约0.099963秒、最大约0.101986秒；70031个近点和原诊断状态统计保持不变。新分析输出在单独目录，不覆盖原包。实时默认屏蔽、C++检测节点、网络和系统库均未改变。下一步继续检查回放流程和屏蔽误删，不把这次一致性通过称作独立场景或穿戴安全验证。</w:t>
+      </w:r>
+    </w:p>
+    <w:p>
+      <w:pPr>
+        <w:keepNext/>
+        <w:pageBreakBefore w:val="0"/>
+        <w:spacing w:after="100"/>
+        <w:jc w:val="left"/>
+      </w:pPr>
+      <w:r>
+        <w:rPr>
+          <w:rFonts w:ascii="Microsoft YaHei" w:hAnsi="Microsoft YaHei"/>
+          <w:color w:val="000000"/>
+          <w:sz w:val="20"/>
+        </w:rPr>
+        <w:t>2026年10月22日</w:t>
+        <w:br/>
+      </w:r>
+      <w:r>
+        <w:rPr>
+          <w:rFonts w:ascii="Microsoft YaHei" w:hAnsi="Microsoft YaHei" w:eastAsia="Microsoft YaHei"/>
+          <w:b/>
+          <w:color w:val="000000"/>
+          <w:sz w:val="24"/>
+        </w:rPr>
+        <w:t>夜间第二步检查离线回放的边界与清理</w:t>
+      </w:r>
+    </w:p>
+    <w:p>
+      <w:pPr>
+        <w:spacing w:after="100"/>
+      </w:pPr>
+      <w:r>
+        <w:t>我接着审核replay_candidate.py，发现原来收集诊断时把坐标系写死成livox_frame，换成其他合法坐标系就可能错误地报告没有结果。启动等待到期后也没有明确中止，而且每次会覆盖目录里的同名试验配置、日志和报告。这一轮只改离线回放工具，不改实时节点或默认屏蔽。</w:t>
+      </w:r>
+    </w:p>
+    <w:p>
+      <w:pPr>
+        <w:spacing w:after="100"/>
+      </w:pPr>
+      <w:r>
+        <w:t>我让回放先检查候选盒的数字、尺寸、大小关系和未确认身份标志，并检查原包是否存在、雷达话题是否为driver2 CustomMsg、首帧坐标系是否匹配。诊断不再限定写死的名字，报告增加应有帧数、处理帧数、完整数量标志和坐标系不符的输出次数。后续帧若坐标系变化，应在报告显现，首帧检查本身不等于整包坐标系已经验证。</w:t>
+      </w:r>
+    </w:p>
+    <w:p>
+      <w:pPr>
+        <w:spacing w:after="100"/>
+      </w:pPr>
+      <w:r>
+        <w:t>每次回放现在创建单独的replay_时间戳目录，复制试验配置到新目录，不覆盖输入候选和历史报告。启动master和等待检测器连接都有明确期限；播放失败、超时或异常时，只清理本工具创建的进程组，必要时分级结束，不停止现场其他ROS进程。占用中的端口会拒绝运行，不加入已有master。</w:t>
+      </w:r>
+    </w:p>
+    <w:p>
+      <w:pPr>
+        <w:spacing w:after="100"/>
+      </w:pPr>
+      <w:r>
+        <w:t>本机起初没有PyYAML，直接导入回放脚本时单元测试失败。我将ROS运行时所需导入移到main内，纯函数测试不依赖ROS或本机安装PyYAML；没有新增系统软件。新增19项纯单元测试，Windows与Jetson均通过，涵盖配置、包元数据、坐标系、就绪超时、部分输出与进程清理。</w:t>
+      </w:r>
+    </w:p>
+    <w:p>
+      <w:pPr>
+        <w:spacing w:after="100"/>
+      </w:pPr>
+      <w:r>
+        <w:t>第一次隔离集成测试中，5帧人工消息已正常回放，但紧接着的端口测试失败。我检查到端口并无监听进程，只剩TCP TIME_WAIT；于是调整探测套接字，允许复用关闭后的连接状态，同时把占用测试改成真正监听的测试套接字。再次测试通过，证明不会把已关闭master的等待状态当作未清理，也不会在已有监听端口启动新回放。</w:t>
+      </w:r>
+    </w:p>
+    <w:p>
+      <w:pPr>
+        <w:spacing w:after="100"/>
+      </w:pPr>
+      <w:r>
+        <w:t>最终隔离集成正确处理了fixture_frame这个非默认名字的5帧人工点云，候选距离为预设0.8米；随后重新处理原有141帧真实记录，仍全部MEDIUM，距离0.905349至0.966950米，平均0.949241米。输入候选文件保持关闭且未改，临时master均已停止。这些是软件回归与隔离回放，不是雷达新采集、独立场景验证或真实障碍精度测试。未启动现场驱动、相机、建图或马达，原始包和默认mask没有改动。</w:t>
       </w:r>
     </w:p>
     <w:sectPr>

</xml_diff>

<commit_message>
Record mask over-removal counterexamples and same-scene holdout limits
</commit_message>
<xml_diff>
--- a/docs/research-diary.docx
+++ b/docs/research-diary.docx
@@ -2024,6 +2024,72 @@
       </w:pPr>
       <w:r>
         <w:t>最终隔离集成正确处理了fixture_frame这个非默认名字的5帧人工点云，候选距离为预设0.8米；随后重新处理原有141帧真实记录，仍全部MEDIUM，距离0.905349至0.966950米，平均0.949241米。输入候选文件保持关闭且未改，临时master均已停止。这些是软件回归与隔离回放，不是雷达新采集、独立场景验证或真实障碍精度测试。未启动现场驱动、相机、建图或马达，原始包和默认mask没有改动。</w:t>
+      </w:r>
+    </w:p>
+    <w:p>
+      <w:pPr>
+        <w:keepNext/>
+        <w:pageBreakBefore w:val="0"/>
+        <w:spacing w:after="100"/>
+        <w:jc w:val="left"/>
+      </w:pPr>
+      <w:r>
+        <w:rPr>
+          <w:rFonts w:ascii="Microsoft YaHei" w:hAnsi="Microsoft YaHei"/>
+          <w:color w:val="000000"/>
+          <w:sz w:val="20"/>
+        </w:rPr>
+        <w:t>2026年10月22日</w:t>
+        <w:br/>
+      </w:r>
+      <w:r>
+        <w:rPr>
+          <w:rFonts w:ascii="Microsoft YaHei" w:hAnsi="Microsoft YaHei" w:eastAsia="Microsoft YaHei"/>
+          <w:b/>
+          <w:color w:val="000000"/>
+          <w:sz w:val="24"/>
+        </w:rPr>
+        <w:t>夜间第三步检查候选屏蔽误删风险</w:t>
+      </w:r>
+    </w:p>
+    <w:p>
+      <w:pPr>
+        <w:spacing w:after="100"/>
+      </w:pPr>
+      <w:r>
+        <w:t>我先检查一个容易误解的地方：过滤以后距离从约0.2米变成约0.95米，并不一定说明判断更准确，也可能是把真正的近处障碍一起删掉。因此我先做离线误删审查，不继续扩大屏蔽范围，也不修改现场默认mask。新工具是audit_mask_risk.py，相关代码与报告整理在work/night03_mask_risk_20261022。</w:t>
+      </w:r>
+    </w:p>
+    <w:p>
+      <w:pPr>
+        <w:spacing w:after="100"/>
+      </w:pPr>
+      <w:r>
+        <w:t>我使用已有原包重新导出的near_returns.npz，要求每帧都有坐标系名，检查时间递增、点到帧索引和候选状态。旧版没有逐帧名字的导出不能直接通过，要用现有bag重新分析，不能假设所有帧的坐标系相同。第一次本地运行发生在导出副本还未传输完成时，因输入文件不存在而停止，没有生成报告；文件到齐后正常重跑。原包和默认关闭的候选配置没有覆盖。</w:t>
+      </w:r>
+    </w:p>
+    <w:p>
+      <w:pPr>
+        <w:spacing w:after="100"/>
+      </w:pPr>
+      <w:r>
+        <w:t>原来用全部141帧拟合的候选盒会删除全部70031个近点，这只是拟合数据检查。我另外只取前70帧的34772个近点拟合新盒，仍使用2厘米余量；后71帧的35259个近点没有参与这次拟合，结果也全部落在盒里。这个结果只说明同一静止记录前后分布比较稳定，不能证明这些点都是装置本身，更不能把后半段当成独立场景或把删除比例说成识别准确率。报告明确区分了拟合段、同场景留出段和未知的空间占用。</w:t>
+      </w:r>
+    </w:p>
+    <w:p>
+      <w:pPr>
+        <w:spacing w:after="100"/>
+      </w:pPr>
+      <w:r>
+        <w:t>我用合成人工点构造反例，再在Jetson的独立ROS master中用当前PCL节点检查。没有屏蔽时，两个近处细杆点集都得到约0.3米的强提醒。启用人工盒后，完全位于盒内的9个细杆点全部删除，只剩0.8米背景，提醒降为中等。跨过盒边界的细杆有7点被盒删除，剩下2点又被邻域支持过滤删除，最后也只报告0.8米背景。未屏蔽时这组端点也有2点被支持过滤删除，但其余近杆点仍能保留。这让我确认，不能只看盒外还留有点就认为细目标一定不会丢。盒外约0.401米的受支持点集则仍得到强提醒。</w:t>
+      </w:r>
+    </w:p>
+    <w:p>
+      <w:pPr>
+        <w:spacing w:after="100"/>
+      </w:pPr>
+      <w:r>
+        <w:t>新增15项纯测试在Windows与Jetson都通过，覆盖细目标、精确边界与浮点边界外、重叠盒、输入异常、坐标系变化和时间分段；6组有无屏蔽的PCL检查也通过。两次本地分析输出逐字节一致，临时master已清理，节点源码、默认mask和原包哈希未变。我没有新采集点云，没有开启驱动、相机、建图或马达。这些反例证明了软件可能误删的路径，不是实际漏检率；当前也没有已知距离真值或穿戴安全结果。公开MASK_RISK_AUDIT.txt和去掉场景几何的摘要便于回家复查，原始点云和拟合盒仍仅本地保存。实时节点的候选与已确认身份诊断尚未增加，不把离线报告的标志冒充实时功能。</w:t>
       </w:r>
     </w:p>
     <w:sectPr>

</xml_diff>

<commit_message>
Document paired replay results and distinguish uncertainty from safety
</commit_message>
<xml_diff>
--- a/docs/research-diary.docx
+++ b/docs/research-diary.docx
@@ -2090,6 +2090,72 @@
       </w:pPr>
       <w:r>
         <w:t>新增15项纯测试在Windows与Jetson都通过，覆盖细目标、精确边界与浮点边界外、重叠盒、输入异常、坐标系变化和时间分段；6组有无屏蔽的PCL检查也通过。两次本地分析输出逐字节一致，临时master已清理，节点源码、默认mask和原包哈希未变。我没有新采集点云，没有开启驱动、相机、建图或马达。这些反例证明了软件可能误删的路径，不是实际漏检率；当前也没有已知距离真值或穿戴安全结果。公开MASK_RISK_AUDIT.txt和去掉场景几何的摘要便于回家复查，原始点云和拟合盒仍仅本地保存。实时节点的候选与已确认身份诊断尚未增加，不把离线报告的标志冒充实时功能。</w:t>
+      </w:r>
+    </w:p>
+    <w:p>
+      <w:pPr>
+        <w:keepNext/>
+        <w:pageBreakBefore w:val="0"/>
+        <w:spacing w:after="100"/>
+        <w:jc w:val="left"/>
+      </w:pPr>
+      <w:r>
+        <w:rPr>
+          <w:rFonts w:ascii="Microsoft YaHei" w:hAnsi="Microsoft YaHei"/>
+          <w:color w:val="000000"/>
+          <w:sz w:val="20"/>
+        </w:rPr>
+        <w:t>2026年10月22日</w:t>
+        <w:br/>
+      </w:r>
+      <w:r>
+        <w:rPr>
+          <w:rFonts w:ascii="Microsoft YaHei" w:hAnsi="Microsoft YaHei" w:eastAsia="Microsoft YaHei"/>
+          <w:b/>
+          <w:color w:val="000000"/>
+          <w:sz w:val="24"/>
+        </w:rPr>
+        <w:t>夜间第四步整理完整点云回放对照</w:t>
+      </w:r>
+    </w:p>
+    <w:p>
+      <w:pPr>
+        <w:spacing w:after="100"/>
+      </w:pPr>
+      <w:r>
+        <w:t>我继续把已有原包做成可复查的完整点云对照。此前的近点计数只能说明盒子删了多少点，这次新增compare_saved_bag.py，让同一个PCL节点分别在不屏蔽和临时候选屏蔽两种条件下处理相同的141帧。程序先检查整包坐标系与时间戳，再用每帧header配对，不把启动等待时的watchdog消息混入点云结果。源码、测试和报告在work/night04_full_comparison_20261022。</w:t>
+      </w:r>
+    </w:p>
+    <w:p>
+      <w:pPr>
+        <w:spacing w:after="100"/>
+      </w:pPr>
+      <w:r>
+        <w:t>两轮均使用1倍回放，完整匹配141帧，原始header跨度13.999583秒，没有缺帧、重复、意外header或坐标系不符输出。不屏蔽时全部是强提醒加近场不确定，距离最小0.200012米、平均0.200783米、最大0.203580米。临时候选屏蔽时全部是中等提醒，最小0.905349米、平均0.949241米、最大0.966950米，每帧平均排除496.674个点。逐帧距离平均增加0.748459米，只表示最终留下的点换了，不能解释成精度提高。</w:t>
+      </w:r>
+    </w:p>
+    <w:p>
+      <w:pPr>
+        <w:spacing w:after="100"/>
+      </w:pPr>
+      <w:r>
+        <w:t>我把几种不同的不确定性分开记录。两轮逐点云输出的UNKNOWN级别都是0，但不屏蔽时141帧都带近场不确定标志，屏蔽后该标志变为0，这是因为盒子过滤发生在近场计数之前，并不代表遮挡消失或所有近点已被证明是支架。另有更近点被邻域支持过滤删掉的标志，不屏蔽时出现1帧，屏蔽后出现21帧；没有标签，不能说这些全是噪声。每轮回放收集诊断的窗口还收到11条无点云header的watchdog消息，单独统计，窗口包含播放器启动等待，不能仅凭数量认定为真实雷达断流。</w:t>
+      </w:r>
+    </w:p>
+    <w:p>
+      <w:pPr>
+        <w:spacing w:after="100"/>
+      </w:pPr>
+      <w:r>
+        <w:t>本次节点回调处理平均耗时分别为36.050和35.739毫秒，P95为36.537和36.180毫秒，最大54.136和53.147毫秒。播放器进程总耗时约15.458和15.508秒，包含启动时间。这只是各跑一次、先后执行的观察，受顺序和负载影响，不是受控性能比较；也不是从雷达采样到提醒的端到端延迟，不能据此宣布提速或满足穿戴实时安全要求。</w:t>
+      </w:r>
+    </w:p>
+    <w:p>
+      <w:pPr>
+        <w:spacing w:after="100"/>
+      </w:pPr>
+      <w:r>
+        <w:t>新增16项纯测试在Windows与Jetson均通过，覆盖配对、缺帧和重复、非有限距离、缺指标、整包坐标系与时间戳，以及公开摘要不含场景几何和逐帧记录。实际PCL双轮回放也通过，临时master已停止。节点源码、默认mask、原包和输入候选配置前后哈希不变，没有现场采集或开启驱动、相机、建图、马达。公开OFFLINE_COMPARISON.txt与筛选后的汇总JSON方便复查，原始逐帧诊断和配置快照只保存在私有报告。候选盒仍来自同一静止样本，既没有独立场景验证，也没有真实目标距离、误报率或漏检率，上一轮发现的细杆误删风险仍然存在。</w:t>
       </w:r>
     </w:p>
     <w:sectPr>

</xml_diff>

<commit_message>
Record isolated provenance tests, logger assertion failure and deployment boundary
</commit_message>
<xml_diff>
--- a/docs/research-diary.docx
+++ b/docs/research-diary.docx
@@ -2156,6 +2156,72 @@
       </w:pPr>
       <w:r>
         <w:t>新增16项纯测试在Windows与Jetson均通过，覆盖配对、缺帧和重复、非有限距离、缺指标、整包坐标系与时间戳，以及公开摘要不含场景几何和逐帧记录。实际PCL双轮回放也通过，临时master已停止。节点源码、默认mask、原包和输入候选配置前后哈希不变，没有现场采集或开启驱动、相机、建图、马达。公开OFFLINE_COMPARISON.txt与筛选后的汇总JSON方便复查，原始逐帧诊断和配置快照只保存在私有报告。候选盒仍来自同一静止样本，既没有独立场景验证，也没有真实目标距离、误报率或漏检率，上一轮发现的细杆误删风险仍然存在。</w:t>
+      </w:r>
+    </w:p>
+    <w:p>
+      <w:pPr>
+        <w:keepNext/>
+        <w:pageBreakBefore w:val="0"/>
+        <w:spacing w:after="100"/>
+        <w:jc w:val="left"/>
+      </w:pPr>
+      <w:r>
+        <w:rPr>
+          <w:rFonts w:ascii="Microsoft YaHei" w:hAnsi="Microsoft YaHei"/>
+          <w:color w:val="000000"/>
+          <w:sz w:val="20"/>
+        </w:rPr>
+        <w:t>2026年10月23日</w:t>
+        <w:br/>
+      </w:r>
+      <w:r>
+        <w:rPr>
+          <w:rFonts w:ascii="Microsoft YaHei" w:hAnsi="Microsoft YaHei" w:eastAsia="Microsoft YaHei"/>
+          <w:b/>
+          <w:color w:val="000000"/>
+          <w:sz w:val="24"/>
+        </w:rPr>
+        <w:t>夜间第五步区分屏蔽配置的确认状态</w:t>
+      </w:r>
+    </w:p>
+    <w:p>
+      <w:pPr>
+        <w:spacing w:after="100"/>
+      </w:pPr>
+      <w:r>
+        <w:t>我接着补充一个显示层面的问题：仅看到self_mask_enabled=true，无法知道这只是静止点拟合出来的候选，还是配置中明确声明已经确认的结构。因此我给haptic节点增加来源诊断，但不让这个标志改变裁剪、距离计算或提醒级别。修改源和测试整理在work/night05_mask_provenance_20261023，公开说明为MASK_PROVENANCE.txt。</w:t>
+      </w:r>
+    </w:p>
+    <w:p>
+      <w:pPr>
+        <w:spacing w:after="100"/>
+      </w:pPr>
+      <w:r>
+        <w:t>新增布尔参数self_identity_confirmed，缺省为false，字符串、整数和数组不作为确认值。诊断按实际开关显示DISABLED、CANDIDATE_UNCONFIRMED或USER_CONFIRMED，同时输出确认值、配置声明这一依据，以及屏蔽空间仍为未知的提示。USER_CONFIRMED只表示有人在配置里明确这样声明，不是自动识别、实际安装验证或安全认证。即使声明已确认，坐标系不符或断流仍要输出UNKNOWN；原始场景候选没有改成已确认。</w:t>
+      </w:r>
+    </w:p>
+    <w:p>
+      <w:pPr>
+        <w:spacing w:after="100"/>
+      </w:pPr>
+      <w:r>
+        <w:t>为保留当前装置的原有状态，我只在Jetson的~/haptic_ws/offline_checks/night05_mask_provenance_20261023建立独立构建副本，并用明确的二进制路径做测试，没有替换~/haptic_ws原工作空间的源码、可执行文件、默认配置或终端启动设置。新版本只在独立测试里运行，现场旧程序还没有这些新增字段。公开仓库的新源码可供审阅和以后重新构建，不能把上传源码说成已经给现场完成部署。</w:t>
+      </w:r>
+    </w:p>
+    <w:p>
+      <w:pPr>
+        <w:spacing w:after="100"/>
+      </w:pPr>
+      <w:r>
+        <w:t>最初的测试在非法参数处失败，因为它要求终端里出现指定的fatal文字。我增加输出记录后确认，非法值对应的进程实际已经以代码1退出，但捕获的终端输出为空。我把检查改成退出码必须为1，并确认该非法节点没有发布诊断话题，而不依赖日志文字。终端文本为空的具体日志设置原因没有继续查明，也没有改ROS日志配置。这两次失败记录保留在本地，不能省略成第一次就全部成功。</w:t>
+      </w:r>
+    </w:p>
+    <w:p>
+      <w:pPr>
+        <w:spacing w:after="100"/>
+      </w:pPr>
+      <w:r>
+        <w:t>最后13项新增来源诊断用例通过，覆盖开关和声明组合、正常输出、坐标系不符、断流，以及三种非法类型。同一开关状态下，只切换确认声明时，人工点集的距离、级别和过滤计数保持一致。原13项核心用例与7项几何屏蔽用例也在独立构建中回归通过，只调整了测试输出目录以免覆盖旧记录。临时master已清理，现场源码、二进制、默认mask和原包前后哈希不变；没有现场雷达、相机、建图或马达操作。已有Boost 1.71与1.83混用的链接警告仍存在，测试通过不代表长期稳定性或真实自身识别已经验证。</w:t>
       </w:r>
     </w:p>
     <w:sectPr>

</xml_diff>

<commit_message>
Record radius tradeoffs without retuning live defaults
</commit_message>
<xml_diff>
--- a/docs/research-diary.docx
+++ b/docs/research-diary.docx
@@ -2222,6 +2222,72 @@
       </w:pPr>
       <w:r>
         <w:t>最后13项新增来源诊断用例通过，覆盖开关和声明组合、正常输出、坐标系不符、断流，以及三种非法类型。同一开关状态下，只切换确认声明时，人工点集的距离、级别和过滤计数保持一致。原13项核心用例与7项几何屏蔽用例也在独立构建中回归通过，只调整了测试输出目录以免覆盖旧记录。临时master已清理，现场源码、二进制、默认mask和原包前后哈希不变；没有现场雷达、相机、建图或马达操作。已有Boost 1.71与1.83混用的链接警告仍存在，测试通过不代表长期稳定性或真实自身识别已经验证。</w:t>
+      </w:r>
+    </w:p>
+    <w:p>
+      <w:pPr>
+        <w:keepNext/>
+        <w:pageBreakBefore w:val="0"/>
+        <w:spacing w:after="100"/>
+        <w:jc w:val="left"/>
+      </w:pPr>
+      <w:r>
+        <w:rPr>
+          <w:rFonts w:ascii="Microsoft YaHei" w:hAnsi="Microsoft YaHei"/>
+          <w:color w:val="000000"/>
+          <w:sz w:val="20"/>
+        </w:rPr>
+        <w:t>2026年10月23日</w:t>
+        <w:br/>
+      </w:r>
+      <w:r>
+        <w:rPr>
+          <w:rFonts w:ascii="Microsoft YaHei" w:hAnsi="Microsoft YaHei" w:eastAsia="Microsoft YaHei"/>
+          <w:b/>
+          <w:color w:val="000000"/>
+          <w:sz w:val="24"/>
+        </w:rPr>
+        <w:t>夜间第六步比较邻域半径的取舍</w:t>
+      </w:r>
+    </w:p>
+    <w:p>
+      <w:pPr>
+        <w:spacing w:after="100"/>
+      </w:pPr>
+      <w:r>
+        <w:t>我把这一步限定为一个小参数对照，不继续扩大软件功能。新增study_support_radius.py，从已有141帧静止记录固定选取第0、10、20直到140帧，共15帧，并把每个选中帧的近点、坐标系和时间戳与已保存的near_returns.npz核对，全部一致。使用上一轮独立构建的二进制处理，不重新编译或替换现场程序。工作整理在work/night06_radius_study_20261023，说明是SUPPORT_RADIUS_STUDY.txt。</w:t>
+      </w:r>
+    </w:p>
+    <w:p>
+      <w:pPr>
+        <w:spacing w:after="100"/>
+      </w:pPr>
+      <w:r>
+        <w:t>我只比较0.04、0.08和0.12米三个邻域半径，邻点参数保持3，距离下限仍为0.2米，屏蔽关闭，提醒阈值、迟滞和超时不变。15帧在三种条件下每帧平均保留约4553.867、11173.533和13904.000个受支持点，平均最近距离分别为0.200937、0.200903和0.200831米。全部选中帧仍是强提醒加近场不确定，说明仅调整邻域半径没有解释或解决这些近点。保留点变多、距离变小也不能直接说精度提高。</w:t>
+      </w:r>
+    </w:p>
+    <w:p>
+      <w:pPr>
+        <w:spacing w:after="100"/>
+      </w:pPr>
+      <w:r>
+        <w:t>我另外构造三种人工点集查看取舍，结果更直观。密集的0.6米目标在三个半径下都保留。稀疏的四个方形角点在0.04和0.08米条件下全部被删，只剩1.5米背景；到0.12米时四点才保留，最近距离约0.601498米。但一个0.5米的单独点，如果旁边0.59米处有受支持的墙面点，0.12米半径也会让它借用墙面的邻点而通过，提醒由中等变强。这个人工单点不能直接当成真实噪声，因此这里只说明较宽松条件会接纳哪些点，不是测出了误报率。每种人工场景连续输入四次后记录结果，避免把原有释放迟滞误当成参数效果。</w:t>
+      </w:r>
+    </w:p>
+    <w:p>
+      <w:pPr>
+        <w:spacing w:after="100"/>
+      </w:pPr>
+      <w:r>
+        <w:t>九项纯测试在Windows和Jetson都通过；三种半径共45个选中帧结果完整唯一配对，没有缺失、重复或意外header，另观察了九个人工场景与半径组合。原包、NPZ、独立二进制、现场源码与二进制、默认配置的前后哈希都没有变化，临时master已停止。这里是逐消息等待结果的离线处理，不是按录制时间播放，没有进行速度、端到端延迟、动态接近或穿戴测试。</w:t>
+      </w:r>
+    </w:p>
+    <w:p>
+      <w:pPr>
+        <w:spacing w:after="100"/>
+      </w:pPr>
+      <w:r>
+        <w:t>我暂时保留0.08米默认值，不因为0.12米留下更多点就直接采用。更严格的邻域可能删掉稀疏小目标，更宽松的邻域也可能让孤立近点通过，需要以后有标签和实测距离的数据再决定。当前有限清单中的参数研究已经完成；已有断流、坐标系和非法参数用例覆盖了发现的软件边界，这些未标注的静止观察本身不足以支持再随意加算法。接下来只整理今早检查说明和交接，不继续为了增加运行次数改动软件。公开摘要不包含逐帧记录、真实场景配置或原始点云，详细诊断仍只保留在本地。</w:t>
       </w:r>
     </w:p>
     <w:sectPr>

</xml_diff>

<commit_message>
Finish overnight review guide and preserve live deployment boundaries
</commit_message>
<xml_diff>
--- a/docs/research-diary.docx
+++ b/docs/research-diary.docx
@@ -2288,6 +2288,64 @@
       </w:pPr>
       <w:r>
         <w:t>我暂时保留0.08米默认值，不因为0.12米留下更多点就直接采用。更严格的邻域可能删掉稀疏小目标，更宽松的邻域也可能让孤立近点通过，需要以后有标签和实测距离的数据再决定。当前有限清单中的参数研究已经完成；已有断流、坐标系和非法参数用例覆盖了发现的软件边界，这些未标注的静止观察本身不足以支持再随意加算法。接下来只整理今早检查说明和交接，不继续为了增加运行次数改动软件。公开摘要不包含逐帧记录、真实场景配置或原始点云，详细诊断仍只保留在本地。</w:t>
+      </w:r>
+    </w:p>
+    <w:p>
+      <w:pPr>
+        <w:keepNext/>
+        <w:pageBreakBefore w:val="0"/>
+        <w:spacing w:after="100"/>
+        <w:jc w:val="left"/>
+      </w:pPr>
+      <w:r>
+        <w:rPr>
+          <w:rFonts w:ascii="Microsoft YaHei" w:hAnsi="Microsoft YaHei"/>
+          <w:color w:val="000000"/>
+          <w:sz w:val="20"/>
+        </w:rPr>
+        <w:t>2026年10月23日</w:t>
+        <w:br/>
+      </w:r>
+      <w:r>
+        <w:rPr>
+          <w:rFonts w:ascii="Microsoft YaHei" w:hAnsi="Microsoft YaHei" w:eastAsia="Microsoft YaHei"/>
+          <w:b/>
+          <w:color w:val="000000"/>
+          <w:sz w:val="24"/>
+        </w:rPr>
+        <w:t>整理次日检查说明并收尾</w:t>
+      </w:r>
+    </w:p>
+    <w:p>
+      <w:pPr>
+        <w:spacing w:after="100"/>
+      </w:pPr>
+      <w:r>
+        <w:t>我把今晚有限清单的最后一步放在整理说明上，没有再增加算法。把已做的采样检查、隔离回放、误删反例、完整云对照和邻域半径取舍整理成“障碍感知软件_次日检查指南_20261023.txt”，放在本月docs。Jetson上也保存了同内容的~/haptic_ws/MORNING_CHECK_20261023.txt，公开整理在docs/MORNING_CHECK_20261023.txt。说明先写结论，再列程序位置、查看汇总和离线回放的命令，以及还没有做的实验。</w:t>
+      </w:r>
+    </w:p>
+    <w:p>
+      <w:pPr>
+        <w:spacing w:after="100"/>
+      </w:pPr>
+      <w:r>
+        <w:t>我特别区分现场程序和独立测试版本。现场~/haptic_ws没有换成新增来源诊断的版本，默认屏蔽仍然关闭；GitHub源码包含新字段，也不能说成现场已经部署。候选盒使已保存样本的平均距离从约0.201米变为0.949米，只证明过滤路径生效。外部细杆可能被候选盒误删，宽邻域也可能接纳借邻点支持的单点，因此不据此宣称精度、误报率或安全性改善。继续保留0.08米邻域和0.2米距离下限，不扩大屏蔽来隐藏这些问题。</w:t>
+      </w:r>
+    </w:p>
+    <w:p>
+      <w:pPr>
+        <w:spacing w:after="100"/>
+      </w:pPr>
+      <w:r>
+        <w:t>本轮只连接检查了说明中五个必要文件是否存在，把说明传到Jetson后读回核对内容，并比较原包、最新NPZ、独立二进制、现场源码与二进制、默认屏蔽配置的哈希，全部与上一轮一致。没有启动新的ROS进程，没有重新采集、重放、编译或增加算法测试；说明里的命令依据现有脚本和已完成测试整理，不能把文件存在检查算作一次新的回放验证。已知Boost混用风险、实际近点身份和穿戴可靠性仍然没有解决。</w:t>
+      </w:r>
+    </w:p>
+    <w:p>
+      <w:pPr>
+        <w:spacing w:after="100"/>
+      </w:pPr>
+      <w:r>
+        <w:t>下一次我建议先在桌面固定条件下，用尺量宽箱子的近表面距离，按2.0、1.5、0.8、0.4米各静止20秒、建议重复三次，再补细杆对照，并保留原始数据、安装状态和运行版本。这些只是尚未执行的计划，要等我决定后开始。机械原型和照片不作为继续软件工作的门槛，也不要求拆掉真实安装支架；局部屏蔽需要原始点云和实际安装范围的人工核对，不能把所有静止点认成自己。今晚有限软件清单到此收尾，交接和同步完成后停止夜间续做，之后不自动部署或扩大实验。</w:t>
       </w:r>
     </w:p>
     <w:sectPr>

</xml_diff>

<commit_message>
Record staged self-filtering distance and future speed reminder goals
</commit_message>
<xml_diff>
--- a/docs/research-diary.docx
+++ b/docs/research-diary.docx
@@ -2346,6 +2346,80 @@
       </w:pPr>
       <w:r>
         <w:t>下一次我建议先在桌面固定条件下，用尺量宽箱子的近表面距离，按2.0、1.5、0.8、0.4米各静止20秒、建议重复三次，再补细杆对照，并保留原始数据、安装状态和运行版本。这些只是尚未执行的计划，要等我决定后开始。机械原型和照片不作为继续软件工作的门槛，也不要求拆掉真实安装支架；局部屏蔽需要原始点云和实际安装范围的人工核对，不能把所有静止点认成自己。今晚有限软件清单到此收尾，交接和同步完成后停止夜间续做，之后不自动部署或扩大实验。</w:t>
+      </w:r>
+    </w:p>
+    <w:p>
+      <w:pPr>
+        <w:keepNext/>
+        <w:pageBreakBefore w:val="0"/>
+        <w:spacing w:after="100"/>
+        <w:jc w:val="left"/>
+      </w:pPr>
+      <w:r>
+        <w:rPr>
+          <w:rFonts w:ascii="Microsoft YaHei" w:hAnsi="Microsoft YaHei"/>
+          <w:color w:val="000000"/>
+          <w:sz w:val="20"/>
+        </w:rPr>
+        <w:t>2026年10月23日</w:t>
+        <w:br/>
+      </w:r>
+      <w:r>
+        <w:rPr>
+          <w:rFonts w:ascii="Microsoft YaHei" w:hAnsi="Microsoft YaHei" w:eastAsia="Microsoft YaHei"/>
+          <w:b/>
+          <w:color w:val="000000"/>
+          <w:sz w:val="24"/>
+        </w:rPr>
+        <w:t>初始化自身过滤与分阶段提醒方案</w:t>
+      </w:r>
+    </w:p>
+    <w:p>
+      <w:pPr>
+        <w:spacing w:after="100"/>
+      </w:pPr>
+      <w:r>
+        <w:t>我重新把目标分成几个阶段。第一步希望排除胸前安装时扫描到的使用者、支架和固定线缆；我想到启动后先用10秒或者更久，提取身边点云的特征，以后再排除属于装置和使用者的近点。第二步只对剩下的外部环境计算距离，越近就输出越强的提醒，先不接震动硬件。第三步以后再考虑速度、距离和时间等多个变量，让快速接近的物体触发更强提醒，并研究停在附近后是否逐渐减弱；这些系数需要通过多次实验确定。我明确先做只看距离的方案，再考虑速度方案。</w:t>
+      </w:r>
+    </w:p>
+    <w:p>
+      <w:pPr>
+        <w:spacing w:after="100"/>
+      </w:pPr>
+      <w:r>
+        <w:t>我也提出能否利用Point-LIO实时输出的点云判断危险。我查看了Point-LIO官方仓库说明，它提供雷达惯性里程计与建图，位姿可以作为后续补偿自身移动的来源，但不直接等于危险判断。我的当前取舍是，第一版仍优先用最新原始雷达点云，在雷达自身坐标系里排除经过确认的局部自身区域，再计算外部目标距离；Point-LIO先保留建图用途，以后可增加位姿辅助。若尝试它处理后的当前点云，需要核对本机实际话题、时间戳、坐标变换、延迟和近点保留情况，不能把RViz累计显示或历史地图直接当作当前障碍。历史点可能保留已经移动的物体。这是方案讨论，本轮没有连接Jetson检查Point-LIO话题或改接输入。官方资料为https://github.com/hku-mars/Point-LIO。</w:t>
+      </w:r>
+    </w:p>
+    <w:p>
+      <w:pPr>
+        <w:spacing w:after="100"/>
+      </w:pPr>
+      <w:r>
+        <w:t>我需要把初始化提取候选和自动确认自己分开。站着不动10秒时，墙面、桌子也会稳定存在；时间拉长并不能单独解决身份问题。可以先在限定的近身空间内统计持续出现的位置，作为待审查的候选，而不是屏蔽所有近点或整段方向。以后在记录充分的情况下，可以结合轻微移动和位姿，观察哪些点相对雷达保持固定、哪些属于世界环境，但同向行人和会动的手臂、衣物仍会混淆，因此不是自动确认保证。只排除核对过的局部几何，被它挡住或删掉的空间仍然未知，不能理解成安全。最终要排除使用者回波，但还没有成品机械原型不妨碍先研究这些软件机制。</w:t>
+      </w:r>
+    </w:p>
+    <w:p>
+      <w:pPr>
+        <w:spacing w:after="100"/>
+      </w:pPr>
+      <w:r>
+        <w:t>我核对当前haptic源文件，输入仍是/livox/lidar的driver2点云，并没有读取Point-LIO地图。程序已有有限有效点处理、可选局部盒屏蔽、邻域支持过滤、最近受支持点距离、强中弱三级输出、迟滞和断流未知状态；距离范围仍0.2到5米，默认局部屏蔽关闭。它还不是识别每个物体，也没有胸前朝向和地面处理。自身过滤的工具和误删测试已经有了，但自动初始化10秒后确认并排除自身还没有做；距离分档已有初版，不是连续强度，也没有真实震动执行。速度、持续物体关联、碰撞时间和停留后衰减都没有实现。不能把昨晚离线测试通过理解为这几项目标全部完成。</w:t>
+      </w:r>
+    </w:p>
+    <w:p>
+      <w:pPr>
+        <w:spacing w:after="100"/>
+      </w:pPr>
+      <w:r>
+        <w:t>对于以后加入速度的方案，我保留两个注意点。相邻帧最近点可能来自不同物体，直接相减会出现假速度，应该先有目标关联或稳定的局部距离估计，再补偿自身移动。另一个是物体靠得很近时，即使停下来，风险也没有消失；可以研究“快速接近的额外提醒”随时间减弱，但保留由距离决定的最低提醒，不能只因停留就衰减到不提醒。这些都是待验证的设计建议，不是已经选定的系数或安全结论。</w:t>
+      </w:r>
+    </w:p>
+    <w:p>
+      <w:pPr>
+        <w:spacing w:after="100"/>
+      </w:pPr>
+      <w:r>
+        <w:t>这次只更新需求、解释现状和记下方案，没有修改检测代码、启动雷达、改变默认屏蔽、接入Point-LIO或恢复夜间自动化，也没有新增实验。下一步建议先讨论并确定初始化阶段如何生成和审查候选自身区域，然后再由我指挥实施，不一次性把三个阶段全部做完。</w:t>
       </w:r>
     </w:p>
     <w:sectPr>

</xml_diff>

<commit_message>
Document live source snapshot and core node reading order
</commit_message>
<xml_diff>
--- a/docs/research-diary.docx
+++ b/docs/research-diary.docx
@@ -2420,6 +2420,56 @@
       </w:pPr>
       <w:r>
         <w:t>这次只更新需求、解释现状和记下方案，没有修改检测代码、启动雷达、改变默认屏蔽、接入Point-LIO或恢复夜间自动化，也没有新增实验。下一步建议先讨论并确定初始化阶段如何生成和审查候选自身区域，然后再由我指挥实施，不一次性把三个阶段全部做完。</w:t>
+      </w:r>
+    </w:p>
+    <w:p>
+      <w:pPr>
+        <w:keepNext/>
+        <w:pageBreakBefore w:val="0"/>
+        <w:spacing w:after="100"/>
+        <w:jc w:val="left"/>
+      </w:pPr>
+      <w:r>
+        <w:rPr>
+          <w:rFonts w:ascii="Microsoft YaHei" w:hAnsi="Microsoft YaHei"/>
+          <w:color w:val="000000"/>
+          <w:sz w:val="20"/>
+        </w:rPr>
+        <w:t>2026年10月23日</w:t>
+        <w:br/>
+      </w:r>
+      <w:r>
+        <w:rPr>
+          <w:rFonts w:ascii="Microsoft YaHei" w:hAnsi="Microsoft YaHei" w:eastAsia="Microsoft YaHei"/>
+          <w:b/>
+          <w:color w:val="000000"/>
+          <w:sz w:val="24"/>
+        </w:rPr>
+        <w:t>取回现场源码并梳理阅读顺序</w:t>
+      </w:r>
+    </w:p>
+    <w:p>
+      <w:pPr>
+        <w:spacing w:after="100"/>
+      </w:pPr>
+      <w:r>
+        <w:t>我想在这台Windows电脑上直接读Jetson现在的源码，弄清主要目标是写在一个文件里，还是拆成了很多文件。因此只读连接Jetson，把现场haptic_feedback包的10个源码、启动、配置和构建文件拷到work/source_reading_20261023/snapshot_20261023_140157/live/haptic_feedback，另把独立测试版本的C++源放在isolated_test，避免把两版混在一起。每个远端文件读两次核对一致，保存大小和SHA256清单；现场核心源码与之前保留的版本一致。没有改远端程序、配置或启动任何节点，也没有复制原始bag、点云或内部日志。</w:t>
+      </w:r>
+    </w:p>
+    <w:p>
+      <w:pPr>
+        <w:spacing w:after="100"/>
+      </w:pPr>
+      <w:r>
+        <w:t>我确认当前核心判断主要集中在src/pcl_proximity_node.cpp，共265行。第255行是入口，第22行读取参数并建立通信，第144行cloud回调处理每帧点云；第89行和95行处理距离等级及迟滞，第117行负责发布，第226行处理断流未知。启动文件launch/pcl_proximity.launch与屏蔽配置config/self_mask.yaml是配套入口，不是另一套判断算法。capture_near_cloud.py是采样分析工具，较早的Python节点和模拟发布器是通信练习。离线比较与测试脚本属于辅助工具，不要求运行核心节点时把它们全部启动。</w:t>
+      </w:r>
+    </w:p>
+    <w:p>
+      <w:pPr>
+        <w:spacing w:after="100"/>
+      </w:pPr>
+      <w:r>
+        <w:t>我把阅读顺序另写到快照根目录的“先读这里.txt”。这次拷贝只是为了阅读，不是新功能实现或运行验证；Windows上能看源文件，不代表已具备ROS与PCL运行环境。自动初始化自身识别、速度和停留衰减仍没有写好，不能把一个核心文件理解成已经完成全部目标。独立版本只多了来源诊断，仍未部署到现场，公开仓库继续保留新版本，不用旧现场源覆盖它。</w:t>
       </w:r>
     </w:p>
     <w:sectPr>

</xml_diff>

<commit_message>
Document Python roadmap, reviewed filtering and remaining first-stage work
</commit_message>
<xml_diff>
--- a/docs/research-diary.docx
+++ b/docs/research-diary.docx
@@ -2470,6 +2470,162 @@
       </w:pPr>
       <w:r>
         <w:t>我把阅读顺序另写到快照根目录的“先读这里.txt”。这次拷贝只是为了阅读，不是新功能实现或运行验证；Windows上能看源文件，不代表已具备ROS与PCL运行环境。自动初始化自身识别、速度和停留衰减仍没有写好，不能把一个核心文件理解成已经完成全部目标。独立版本只多了来源诊断，仍未部署到现场，公开仓库继续保留新版本，不用旧现场源覆盖它。</w:t>
+      </w:r>
+    </w:p>
+    <w:p>
+      <w:pPr>
+        <w:keepNext/>
+        <w:pageBreakBefore w:val="0"/>
+        <w:spacing w:after="100"/>
+        <w:jc w:val="left"/>
+      </w:pPr>
+      <w:r>
+        <w:rPr>
+          <w:rFonts w:ascii="Microsoft YaHei" w:hAnsi="Microsoft YaHei"/>
+          <w:color w:val="000000"/>
+          <w:sz w:val="20"/>
+        </w:rPr>
+        <w:t>2026年10月23日</w:t>
+        <w:br/>
+      </w:r>
+      <w:r>
+        <w:rPr>
+          <w:rFonts w:ascii="Microsoft YaHei" w:hAnsi="Microsoft YaHei" w:eastAsia="Microsoft YaHei"/>
+          <w:b/>
+          <w:color w:val="000000"/>
+          <w:sz w:val="24"/>
+        </w:rPr>
+        <w:t>用Python开始初始化候选并整理后续开发框架</w:t>
+      </w:r>
+    </w:p>
+    <w:p>
+      <w:pPr>
+        <w:spacing w:after="100"/>
+      </w:pPr>
+      <w:r>
+        <w:t>我再次确认了自己想做的顺序：先排除胸前佩戴时属于使用者、支架或固定线缆的回波，再按剩余外物的距离输出提醒，最后才加入接近速度和时间变化。初始化10秒或更久是我想尝试的方法，但我需要区分“持续出现”与“已经确认属于自己”。墙面和桌子在静止记录中也会持续出现，所以初始化先生成可以查看的候选，不直接删除整段方向或所有近点。快速接近时额外加强、停下后逐渐减弱仍是后续设想；即使以后做衰减，也要保留近距离本身的提醒底线。</w:t>
+      </w:r>
+    </w:p>
+    <w:p>
+      <w:pPr>
+        <w:spacing w:after="100"/>
+      </w:pPr>
+      <w:r>
+        <w:t>我更熟悉Python，所以决定后续新增业务逻辑优先用Python，已有C++和PCL先保留。当前C++已有局部盒过滤、邻域支持、距离分档、迟滞和断流未知，但没有自动自身识别、连续强度、速度或马达控制。Point-LIO可以以后提供位姿辅助；当前先用新到达的原始雷达点，不能把历史地图直接当作眼前障碍。官方Point-LIO说明仍是https://github.com/hku-mars/Point-LIO，本轮没有把它的输出接入提醒程序。</w:t>
+      </w:r>
+    </w:p>
+    <w:p>
+      <w:pPr>
+        <w:spacing w:after="100"/>
+      </w:pPr>
+      <w:r>
+        <w:t>我先把初始化拆成一个可单独阅读和测试的Python工具initialization_candidates.py，放在本月work/python_init_20261023/tools，并按八个区段写中文说明。它复用原有audit_mask_risk.py的数据检查，从导出的near_returns.npz中按时间取前10秒，按2厘米体素统计出现率，同一格同一帧只计一次。默认总出现率至少80%，五个时间段各至少50%，至少30帧，最大时间间隔0.3秒。这些是原型参数，不是身份概率。输出只有candidate_review.json和candidate_voxels.csv，屏蔽和身份确认始终为false，也没有直接可载入现场的self_boxes。</w:t>
+      </w:r>
+    </w:p>
+    <w:p>
+      <w:pPr>
+        <w:spacing w:after="100"/>
+      </w:pPr>
+      <w:r>
+        <w:t>14项针对性测试在Windows和Jetson的Python3.8环境均通过，覆盖重复点、没有近点的帧、时间分段、负坐标、窗口外点、坐标系和时间异常、时长不足，以及原文件不覆盖。旧静止样本前10秒101帧得到77个候选体素，两台机器完整报告一致。这只证明统计实现一致，不能证明77个格子都是身体。新工具在Jetson的~/haptic_ws/tools/python_init_20261023，未替换现场C++或默认屏蔽。</w:t>
+      </w:r>
+    </w:p>
+    <w:p>
+      <w:pPr>
+        <w:spacing w:after="100"/>
+      </w:pPr>
+      <w:r>
+        <w:t>我补充说雷达已经开启。检查时Jetson可以连接，但没有ROS master和驱动进程，当前有线地址也不包含原驱动的接收地址。经我明确同意，只临时补回原接收地址并保留已有地址，不修改永久网络配置；随后在独立master中启动现有驱动，录制15秒，再停止本次启动的录制、驱动和master。得到141帧点云和2828条IMU，点云时间跨度约14.00005秒，前10秒100帧得到198个候选体素。现场核心、屏蔽和驱动配置文件哈希前后不变。原包在~/bags/haptic/python_init_20261023_143028/raw.bag，场景数据保持私有；这不是有身份标签或受控姿态的实验，不能用198和77比较精度。</w:t>
+      </w:r>
+    </w:p>
+    <w:p>
+      <w:pPr>
+        <w:spacing w:after="100"/>
+      </w:pPr>
+      <w:r>
+        <w:t>我随后澄清，雷达开着只是表示需要时可以用，还是继续原来的软件与说明任务，不要把它变成新的实时测试主线。已开始的短采样结束后不再扩大实验。临时通信地址暂留，没有写入永久设置；本次临时服务已经退出，没有启动Point-LIO、相机、距离提醒节点或马达。</w:t>
+      </w:r>
+    </w:p>
+    <w:p>
+      <w:pPr>
+        <w:spacing w:after="100"/>
+      </w:pPr>
+      <w:r>
+        <w:t>为了回家和更换模型后能接着做，我整理了“障碍感知开发框架与后续模型交接_20261023.txt”以及本机路径命令表。框架写清已有代码、计划接口、版本差别、运行命令、每步验收和禁止夸大的结论。下一步建议先用Python做候选点云的查看与审核，再实现经过审核的过滤接口，随后考虑实时节点和连续距离强度。速度、时间和硬件后置。我也保留原始现场代码，另做中文分区学习副本，检查原265行代码全部保留、只插入说明注释；没有把学习副本部署到现场。整个包的逐行讲解仍可随之后阅读继续补充。</w:t>
+      </w:r>
+    </w:p>
+    <w:p>
+      <w:pPr>
+        <w:keepNext/>
+        <w:pageBreakBefore w:val="0"/>
+        <w:spacing w:after="100"/>
+        <w:jc w:val="left"/>
+      </w:pPr>
+      <w:r>
+        <w:rPr>
+          <w:rFonts w:ascii="Microsoft YaHei" w:hAnsi="Microsoft YaHei"/>
+          <w:color w:val="000000"/>
+          <w:sz w:val="20"/>
+        </w:rPr>
+        <w:t>2026年10月23日</w:t>
+        <w:br/>
+      </w:r>
+      <w:r>
+        <w:rPr>
+          <w:rFonts w:ascii="Microsoft YaHei" w:hAnsi="Microsoft YaHei" w:eastAsia="Microsoft YaHei"/>
+          <w:b/>
+          <w:color w:val="000000"/>
+          <w:sz w:val="24"/>
+        </w:rPr>
+        <w:t>继续第一步的候选审核与局部过滤预览</w:t>
+      </w:r>
+    </w:p>
+    <w:p>
+      <w:pPr>
+        <w:spacing w:after="100"/>
+      </w:pPr>
+      <w:r>
+        <w:t>我要求继续原来的开发，并再次确认第一步：排除胸前佩戴时扫描到的使用者、支架和固定线缆，让剩余外部环境的距离判断不再被自身回波干扰。初始化稳定点只是找候选的方法，不能把候选提取完成就说第一步完成。因此这次继续补候选查看、逐格审核和过滤预览，暂时不进入速度和震动硬件。</w:t>
+      </w:r>
+    </w:p>
+    <w:p>
+      <w:pPr>
+        <w:spacing w:after="100"/>
+      </w:pPr>
+      <w:r>
+        <w:t>我新增review_self_mask.py和self_review_template.html，把候选在X-Y、X-Z、Y-Z三个投影中显示，并保留抽样原始近点作背景。每个候选可标为自身、外物或未确认，默认全部未确认；标为自身时需要该格理由和本次审核依据。导出记录绑定候选文件SHA，Python要求所有候选都有记录，拒绝换用其他候选、漏项、重复项和没有依据的自身声明。生成的审核配置仍默认关闭，确认字段只是审核者的声明，不是软件识别出了身体。</w:t>
+      </w:r>
+    </w:p>
+    <w:p>
+      <w:pPr>
+        <w:spacing w:after="100"/>
+      </w:pPr>
+      <w:r>
+        <w:t>我也增加了纯Python局部体素过滤预览。只匹配审核接受的小格，不扩成整个方向或一个大盒；默认关闭时全部有效点保留，外物与未确认候选也保留，非有限值和零点单独统计，坐标系不符拒绝处理。测试覆盖负坐标和半开边界，并明确保留一个误删反例：外部物体如果进入已经选中的同一体素，几何方法仍会删掉它，不能声称误删问题已解决。这里生成的是离线预览报告，尚未连接真实距离节点。</w:t>
+      </w:r>
+    </w:p>
+    <w:p>
+      <w:pPr>
+        <w:spacing w:after="100"/>
+      </w:pPr>
+      <w:r>
+        <w:t>核对GitHub目录时，我发现旧audit_mask_risk.py在仓库根目录，而Jetson独立工具把它放在同目录，原先只写同目录导入会影响下载后运行。我补上两种明确布局的加载方式和一项目录布局测试，旧文件没有移动。初始化现在15项测试、审核过滤16项，共31项，在Windows和Jetson均通过；生成了本轮保存样本的审核HTML，现场核心和默认屏蔽前后哈希保持不变。这一轮没有新录包或启动ROS。完整新工具另放在~/haptic_ws/tools/self_review_20261023，保留较早版本。</w:t>
+      </w:r>
+    </w:p>
+    <w:p>
+      <w:pPr>
+        <w:spacing w:after="100"/>
+      </w:pPr>
+      <w:r>
+        <w:t>页面生成和JavaScript语法检查通过，但浏览器工具限制打开file协议，因此没有实际验证点击、导出或手机排版，也没有尝试绕过限制。我另外生成并检查了近点的静态正交投影图。最初绘图库导入因当前环境没有matplotlib而失败，随后使用已有图像库画出带坐标轴的点分布，没有为此安装软件。图中只包含0至0.5米的近点，金色是未确认候选，不代表已知身体区域；实际场景暂时没有进行人工身份审核。</w:t>
+      </w:r>
+    </w:p>
+    <w:p>
+      <w:pPr>
+        <w:spacing w:after="100"/>
+      </w:pPr>
+      <w:r>
+        <w:t>目前第一步已经有初始化、审核和离线局部排除的软件原型；还需要审核实际区域、接入实时输入，并做保留外物的对照，才能报告现场第一步已完成。后续继续优先Python，文件与命令补进“障碍感知开发框架与后续模型交接_20261023.txt”。我会把软件实现、实际身份确认和穿戴验证分别记录，不将静止样本拟合结果当作完整自身识别。</w:t>
       </w:r>
     </w:p>
     <w:sectPr>

</xml_diff>

<commit_message>
Record bounded exclusion trial and identity limits
</commit_message>
<xml_diff>
--- a/docs/research-diary.docx
+++ b/docs/research-diary.docx
@@ -2626,6 +2626,72 @@
       </w:pPr>
       <w:r>
         <w:t>目前第一步已经有初始化、审核和离线局部排除的软件原型；还需要审核实际区域、接入实时输入，并做保留外物的对照，才能报告现场第一步已完成。后续继续优先Python，文件与命令补进“障碍感知开发框架与后续模型交接_20261023.txt”。我会把软件实现、实际身份确认和穿戴验证分别记录，不将静止样本拟合结果当作完整自身识别。</w:t>
+      </w:r>
+    </w:p>
+    <w:p>
+      <w:pPr>
+        <w:keepNext/>
+        <w:pageBreakBefore w:val="0"/>
+        <w:spacing w:after="100"/>
+        <w:jc w:val="left"/>
+      </w:pPr>
+      <w:r>
+        <w:rPr>
+          <w:rFonts w:ascii="Microsoft YaHei" w:hAnsi="Microsoft YaHei"/>
+          <w:color w:val="000000"/>
+          <w:sz w:val="20"/>
+        </w:rPr>
+        <w:t>2026年10月23日</w:t>
+        <w:br/>
+      </w:r>
+      <w:r>
+        <w:rPr>
+          <w:rFonts w:ascii="Microsoft YaHei" w:hAnsi="Microsoft YaHei" w:eastAsia="Microsoft YaHei"/>
+          <w:b/>
+          <w:color w:val="000000"/>
+          <w:sz w:val="24"/>
+        </w:rPr>
+        <w:t>用新采点云验证局部候选排除</w:t>
+      </w:r>
+    </w:p>
+    <w:p>
+      <w:pPr>
+        <w:spacing w:after="100"/>
+      </w:pPr>
+      <w:r>
+        <w:t>我在问清三个Python文件的作用后，明确要求雷达开启时做一次测试，看看能否顺利排除。检查Jetson可以连接，之前的临时通信地址仍存在，但没有驱动和ROS master，因此只临时启动现有驱动与独立master，录制30秒。没有改网络、Point-LIO、相机、马达或默认屏蔽，也没有改三个功能程序；新增的是独立验证脚本verify_candidate_exclusion.py。</w:t>
+      </w:r>
+    </w:p>
+    <w:p>
+      <w:pPr>
+        <w:spacing w:after="100"/>
+      </w:pPr>
+      <w:r>
+        <w:t>这次得到291帧完整点云，header跨度约29.000338秒。前10秒101帧提取出180个2厘米候选格，再用后续190帧检查。真实候选还没有经过身体或支架身份核对，所以先验证默认未确认时排除数为0；另一组只在内存中模拟审核接受这些格子，调用实际review_self_mask.preview函数。这份模拟审核是测试输入，没有保存为正式自身配置，也没有部署到日常流程。</w:t>
+      </w:r>
+    </w:p>
+    <w:p>
+      <w:pPr>
+        <w:spacing w:after="100"/>
+      </w:pPr>
+      <w:r>
+        <w:t>测试配置在后续段排除146816个点，保留2227822个有效点，区域外点被删除数为0。全291帧合计排除225059个点、保留3411816个有效点；2183125个无效或零坐标点另计，不把它们冒充自身排除效果。每帧都将实际过滤结果与独立计算的格子归属比较，并核对输入数组没有被修改，全部一致。另在原包之外放入人工控制点，选中格内12点全部排除、格外12点全部保留。</w:t>
+      </w:r>
+    </w:p>
+    <w:p>
+      <w:pPr>
+        <w:spacing w:after="100"/>
+      </w:pPr>
+      <w:r>
+        <w:t>我能据此确认局部排除的软件机制按选定范围执行，但不能确认被删掉的都属于使用者。后续段仍来自同一记录，不能当独立场景；真实外物如果进入选中格，也可能被删，所以区域外删除0并不是实际误报或漏报率。离线完整校验约38.95秒，包含bag反序列化、两组对照、复制、断言与哈希，不拿它当实时节点的处理速度。实际自身身份审核、实时ROS接入和受控外物对照仍未完成，第一步还不能报告现场完成。</w:t>
+      </w:r>
+    </w:p>
+    <w:p>
+      <w:pPr>
+        <w:spacing w:after="100"/>
+      </w:pPr>
+      <w:r>
+        <w:t>测试结束后本次录制、驱动和临时master均已停止，核心程序、默认屏蔽、驱动配置和两个Python功能文件哈希前后不变，原包和候选也保持。私有数据在~/bags/haptic/exclusion_check_20261023_151142，Windows本月work/test_self_exclusion_20261023保存报告与近点备份，原始新bag仍留Jetson。结果说明放到docs/第一步候选排除_实测结果_20261023.txt，另做使用同一抽样的近点过滤前后图并视觉检查；图只显示0至0.5米后续近点，不当作全环境或自身身份图。公开仅上传验证代码、无几何的汇总、说明和日记，原始场景资料保持私有。</w:t>
       </w:r>
     </w:p>
     <w:sectPr>

</xml_diff>

<commit_message>
Add detailed first-stage pseudocode manual and reading diary
</commit_message>
<xml_diff>
--- a/docs/research-diary.docx
+++ b/docs/research-diary.docx
@@ -2692,6 +2692,72 @@
       </w:pPr>
       <w:r>
         <w:t>测试结束后本次录制、驱动和临时master均已停止，核心程序、默认屏蔽、驱动配置和两个Python功能文件哈希前后不变，原包和候选也保持。私有数据在~/bags/haptic/exclusion_check_20261023_151142，Windows本月work/test_self_exclusion_20261023保存报告与近点备份，原始新bag仍留Jetson。结果说明放到docs/第一步候选排除_实测结果_20261023.txt，另做使用同一抽样的近点过滤前后图并视觉检查；图只显示0至0.5米后续近点，不当作全环境或自身身份图。公开仅上传验证代码、无几何的汇总、说明和日记，原始场景资料保持私有。</w:t>
+      </w:r>
+    </w:p>
+    <w:p>
+      <w:pPr>
+        <w:keepNext/>
+        <w:pageBreakBefore w:val="0"/>
+        <w:spacing w:after="100"/>
+        <w:jc w:val="left"/>
+      </w:pPr>
+      <w:r>
+        <w:rPr>
+          <w:rFonts w:ascii="Microsoft YaHei" w:hAnsi="Microsoft YaHei"/>
+          <w:color w:val="000000"/>
+          <w:sz w:val="20"/>
+        </w:rPr>
+        <w:t>2026年10月23日</w:t>
+        <w:br/>
+      </w:r>
+      <w:r>
+        <w:rPr>
+          <w:rFonts w:ascii="Microsoft YaHei" w:hAnsi="Microsoft YaHei" w:eastAsia="Microsoft YaHei"/>
+          <w:b/>
+          <w:color w:val="000000"/>
+          <w:sz w:val="24"/>
+        </w:rPr>
+        <w:t>先读懂第一版三个Python文件</w:t>
+      </w:r>
+    </w:p>
+    <w:p>
+      <w:pPr>
+        <w:spacing w:after="100"/>
+      </w:pPr>
+      <w:r>
+        <w:t>我决定先不推进第二步，先把第一版代码读懂。因此这次只整理教学资料，没有改功能代码，也没有连接Jetson、启动ROS或重新采集点云。我把initialization_candidates.py、review_self_mask.py和audit_mask_risk.py按实际源码拆开，做成23页的中文伪代码手册，并保留可搜索的文字版。</w:t>
+      </w:r>
+    </w:p>
+    <w:p>
+      <w:pPr>
+        <w:spacing w:after="100"/>
+      </w:pPr>
+      <w:r>
+        <w:t>我先梳理点、帧、时间戳、坐标系和NPZ数组，再顺着入口、输入检查、前10秒统计、按帧体素去重、整体与分段出现率、人工审核以及局部过滤逐函数阅读。旧audit文件在新流程中主要提供checked_sample检查函数，不等于每次都启动旧盒子风险审查；HTML也只是审核界面，不是另一个Python感知算法。手册将旧盒与新体素的边界、用途分开说明，并附上全部函数的源码行号。</w:t>
+      </w:r>
+    </w:p>
+    <w:p>
+      <w:pPr>
+        <w:spacing w:after="100"/>
+      </w:pPr>
+      <w:r>
+        <w:t>为了检验解释是否与实现一致，我构造了一组教学数据调用实际函数。100帧窗口中A出现85帧、B出现100帧，增加同帧重复点不会提高出现率。教学审核只接受A后，七个输入点中排除1点、无效2点、保留4点；关闭预览时保留5个有效点。旧盒人工反例删除数依次为9、7、6、0。这只是合成教学演算，不是新的实物测量或身体身份验证。三个源文件指纹保持不变。</w:t>
+      </w:r>
+    </w:p>
+    <w:p>
+      <w:pPr>
+        <w:spacing w:after="100"/>
+      </w:pPr>
+      <w:r>
+        <w:t>我特别区分了候选稳定、审核接受和实际过滤。当前preview返回与输入一一对应的布尔标记，不改写原点云；命令行保存的是审核配置和统计，不是过滤后的ROS点云。真实自身区域审核、实时接入和受控外物对照仍未完成，不能把这份手册或先前模拟审核测试说成第一步已现场完成。下一步先按手册中的例子对照源码阅读，不在这次扩展速度或马达功能。</w:t>
+      </w:r>
+    </w:p>
+    <w:p>
+      <w:pPr>
+        <w:spacing w:after="100"/>
+      </w:pPr>
+      <w:r>
+        <w:t>本机手册位于本月docs/第一阶段点云处理_三个Python文件伪代码详解_20261023.docx，旁边有同名txt。公开对应文件为docs/FIRST_STAGE_PSEUDOCODE_20261023.docx和txt，继续将筛选后的日记放在docs/research-diary.docx，并更新development-log.txt和CONTINUE_HERE.txt。手册逐页检查；同步状态另外核对，不把准备上传当作已上传。</w:t>
       </w:r>
     </w:p>
     <w:sectPr>

</xml_diff>

<commit_message>
Document distance strength tests and update research diary
</commit_message>
<xml_diff>
--- a/docs/research-diary.docx
+++ b/docs/research-diary.docx
@@ -2758,6 +2758,104 @@
       </w:pPr>
       <w:r>
         <w:t>本机手册位于本月docs/第一阶段点云处理_三个Python文件伪代码详解_20261023.docx，旁边有同名txt。公开对应文件为docs/FIRST_STAGE_PSEUDOCODE_20261023.docx和txt，继续将筛选后的日记放在docs/research-diary.docx，并更新development-log.txt和CONTINUE_HERE.txt。手册逐页检查；同步状态另外核对，不把准备上传当作已上传。</w:t>
+      </w:r>
+    </w:p>
+    <w:p>
+      <w:pPr>
+        <w:keepNext/>
+        <w:pageBreakBefore w:val="0"/>
+        <w:spacing w:after="20"/>
+        <w:jc w:val="left"/>
+      </w:pPr>
+      <w:r>
+        <w:rPr>
+          <w:rFonts w:ascii="Microsoft YaHei" w:hAnsi="Microsoft YaHei"/>
+          <w:color w:val="000000"/>
+          <w:sz w:val="20"/>
+        </w:rPr>
+        <w:t>2026年10月23日</w:t>
+        <w:br/>
+      </w:r>
+      <w:r>
+        <w:rPr>
+          <w:rFonts w:ascii="Microsoft YaHei" w:hAnsi="Microsoft YaHei" w:eastAsia="Microsoft YaHei"/>
+          <w:b/>
+          <w:color w:val="000000"/>
+          <w:sz w:val="24"/>
+        </w:rPr>
+        <w:t>开始第二步距离到提醒强度</w:t>
+      </w:r>
+    </w:p>
+    <w:p>
+      <w:pPr>
+        <w:spacing w:after="20"/>
+      </w:pPr>
+      <w:r>
+        <w:t>我在整理完第一版代码的伪代码后，决定开始第二个目标：先排除已经确认属于身体或装置的点，再对剩余点根据距离计算提醒强度，越近越强。速度和真实马达仍不接入。我继续使用比较熟悉的Python，把主要逻辑、ROS输入输出和离线读包分开，复用第一步的review_self_mask.preview，没有修改原来的三个功能文件，也没有替换C++、Point-LIO、Livox、网络或桌面命令。</w:t>
+      </w:r>
+    </w:p>
+    <w:p>
+      <w:pPr>
+        <w:spacing w:after="20"/>
+      </w:pPr>
+      <w:r>
+        <w:t>主要功能在distance_policy.py，distance_node.py只负责ROS1适配，replay_distance.py只读完整bag并保存新的CSV和摘要，test_distance_policy.py保存人工点测试。默认先不启用自身屏蔽；只有显式提供审核配置并打开apply_self_mask时才应用。审核声明仍不等于身体身份已经被物理证明，未审查的稳定候选不能自动当成自身删除。新节点使用/haptic/distance_v2独立话题，不覆盖旧的/haptic/proximity。</w:t>
+      </w:r>
+    </w:p>
+    <w:p>
+      <w:pPr>
+        <w:spacing w:after="20"/>
+      </w:pPr>
+      <w:r>
+        <w:t>我先用分段线性规则把距离变成0到1的连续软件目标值：2米及以外为0，1米为0.5，0.5米及以内为1，中间线性变化；1.5米是0.25，0.75米是0.75。这只是第一版便于验证的规则，不是实验拟合的最佳震动系数。连续值尚未平滑；同时保留离散等级的0.1米释放迟滞和连续2帧减弱条件，等级增强立即发生。</w:t>
+      </w:r>
+    </w:p>
+    <w:p>
+      <w:pPr>
+        <w:spacing w:after="20"/>
+      </w:pPr>
+      <w:r>
+        <w:t>我采用设备已有的SciPy cKDTree作0.08米邻域查询，要求3个其他点，明确减掉查询点自己。查阅官方接口确认return_length可返回邻居数量。Windows环境没有SciPy，所以只在小数组上用NumPy参考算法测试；Jetson已装SciPy1.10.1，不需要安装或升级系统库。邻域支持只能减少部分孤立回波影响，不等于物体识别；如果更近处有未支持回波，输出未知而不是安静的0。0.2米以内未排除回波也仍标成近场不确定，没有为了让结果好看而扩大屏蔽。</w:t>
+      </w:r>
+    </w:p>
+    <w:p>
+      <w:pPr>
+        <w:spacing w:after="20"/>
+      </w:pPr>
+      <w:r>
+        <w:t>我加入消息点数、坐标系、时间戳递增、消息新旧、发布时年龄和wall-time断流检查。计算超过0.5秒时，即使回调还忙，独立检查线程也发布未知。JSON中未知距离和强度为null，单独Float32话题为NaN，不当作PWM。原始点和包不改写。当前距离相对雷达原点，覆盖所有可见方向，没有前方或地面筛选，也没有把累积地图接成输入。</w:t>
+      </w:r>
+    </w:p>
+    <w:p>
+      <w:pPr>
+        <w:spacing w:after="20"/>
+      </w:pPr>
+      <w:r>
+        <w:t>本机33项测试中32通过，SciPy对照1项跳过；Jetson33项全部通过，包括两种邻域实现的对照。第一步原有31项回归在本机通过。隔离ROS合成检查最终16项通过，测试了0.25、1、0.5强度、合成审核只排除1点、近场与孤立近点、错误坐标系、点数不符、旧或未来消息、重复时间戳、停止输入和慢回调。合成审核仅是测试输入，不是实际穿戴身份标注。临时节点与独立master均已停止。</w:t>
+      </w:r>
+    </w:p>
+    <w:p>
+      <w:pPr>
+        <w:spacing w:after="20"/>
+      </w:pPr>
+      <w:r>
+        <w:t>补测时发现发布前年龄检查会把已有的旧消息拒绝原因覆盖为另一种状态。我限制它只复查原本有效的结果后重测。慢回调测试的子进程又因为PYTHONPATH覆盖ROS路径而找不到消息包，我修正测试环境保留原路径后通过。这些失败保留内部记录，没有改ROS系统或消息定义来绕过。</w:t>
+      </w:r>
+    </w:p>
+    <w:p>
+      <w:pPr>
+        <w:spacing w:after="20"/>
+      </w:pPr>
+      <w:r>
+        <w:t>我另用之前保存的完整291帧记录做无屏蔽基线，原包前后指纹相同。291帧均报告NEAR_FIELD_UNCERTAIN，没有有效最终强度，因为真实近身区域尚未审核。这不是识别失败率或真实精度，而是程序没有擅自把近回波当成身体。离线平均计算约62.10毫秒每帧，包含消息转数组与计算，不是端到端延迟或长时实时性能结论。这次没有启动现场驱动、采集、建图、相机或马达。</w:t>
+      </w:r>
+    </w:p>
+    <w:p>
+      <w:pPr>
+        <w:spacing w:after="20"/>
+      </w:pPr>
+      <w:r>
+        <w:t>本机代码在本月work/distance_v2_20261023/code；Jetson放在新建的~/haptic_ws/tools/distance_v2_20261023_161421/code，不替换现场程序。说明放到docs/第二步距离提醒_原理与使用命令_20261023.txt，具体启动路径另放同目录路径说明。第二步的软件第一版和ROS接口已做出来，但实际自身区域核对、已知距离外物、穿戴晃动、地面影响与长时动态测试仍未完成。我先保留这些限制，等待下一步指挥，不自动推进速度或马达。</w:t>
       </w:r>
     </w:p>
     <w:sectPr>

</xml_diff>

<commit_message>
Document strength window launch and synthetic validation in diary
</commit_message>
<xml_diff>
--- a/docs/research-diary.docx
+++ b/docs/research-diary.docx
@@ -2856,6 +2856,88 @@
       </w:pPr>
       <w:r>
         <w:t>本机代码在本月work/distance_v2_20261023/code；Jetson放在新建的~/haptic_ws/tools/distance_v2_20261023_161421/code，不替换现场程序。说明放到docs/第二步距离提醒_原理与使用命令_20261023.txt，具体启动路径另放同目录路径说明。第二步的软件第一版和ROS接口已做出来，但实际自身区域核对、已知距离外物、穿戴晃动、地面影响与长时动态测试仍未完成。我先保留这些限制，等待下一步指挥，不自动推进速度或马达。</w:t>
+      </w:r>
+    </w:p>
+    <w:p>
+      <w:pPr>
+        <w:keepNext/>
+        <w:pageBreakBefore w:val="0"/>
+        <w:spacing w:after="20" w:line="264" w:lineRule="auto"/>
+        <w:jc w:val="left"/>
+      </w:pPr>
+      <w:r>
+        <w:rPr>
+          <w:rFonts w:ascii="Microsoft YaHei" w:hAnsi="Microsoft YaHei"/>
+          <w:color w:val="000000"/>
+          <w:sz w:val="20"/>
+        </w:rPr>
+        <w:t>2026年10月23日</w:t>
+        <w:br/>
+      </w:r>
+      <w:r>
+        <w:rPr>
+          <w:rFonts w:ascii="Microsoft YaHei" w:hAnsi="Microsoft YaHei" w:eastAsia="Microsoft YaHei"/>
+          <w:b/>
+          <w:color w:val="000000"/>
+          <w:sz w:val="24"/>
+        </w:rPr>
+        <w:t>为拿起设备试验增加强度显示窗口</w:t>
+      </w:r>
+    </w:p>
+    <w:p>
+      <w:pPr>
+        <w:spacing w:after="20" w:line="264" w:lineRule="auto"/>
+      </w:pPr>
+      <w:r>
+        <w:t>我准备拿起设备观察第二步的效果，因此需要一个能直接看到提醒强度的窗口，而不是只在终端里读数字。我决定只增加显示和启动入口，不改距离策略、原来的建图、雷达驱动或默认自身屏蔽。检查发现Jetson已有PyQt5和所需组件，不用安装软件；当时没有ROS master，所以不能把雷达通电当成已经有实时数据。</w:t>
+      </w:r>
+    </w:p>
+    <w:p>
+      <w:pPr>
+        <w:spacing w:after="20" w:line="264" w:lineRule="auto"/>
+      </w:pPr>
+      <w:r>
+        <w:t>我把显示数据校验放在strength_view_model.py，窗口放在strength_display.py，启动检查和进程管理放在start_strength_display.py，再用start_strength_display.sh加载原来的ROS环境。窗口只订阅同一个/haptic/distance_v2/report，显示0到100%强度、距离、条形、状态、自身过滤状态和近点统计。未知时清掉百分比，显示未知和具体原因；候选距离只放在诊断区，不冒充已经确认的外物。窗口还独立检查报告年龄，超过约0.75秒没有更新就清掉旧强度。</w:t>
+      </w:r>
+    </w:p>
+    <w:p>
+      <w:pPr>
+        <w:spacing w:after="20" w:line="264" w:lineRule="auto"/>
+      </w:pPr>
+      <w:r>
+        <w:t>我增加了稳定入口~/eno/sh/start_haptic_strength.sh。原来的雷达launch先照常运行，再开终端执行bash ~/eno/sh/start_haptic_strength.sh。已有第二步report发布者时启动器只开窗口，不改它的配置；没有时才启动一个独立名字的自建计算节点。关窗只结束这次自己启动的进程，不停止已有雷达、Point-LIO或别人的节点。--demo只在窗口里生成合成数据，明显标为模拟，不读取雷达，也不发布ROS。</w:t>
+      </w:r>
+    </w:p>
+    <w:p>
+      <w:pPr>
+        <w:spacing w:after="20" w:line="264" w:lineRule="auto"/>
+      </w:pPr>
+      <w:r>
+        <w:t>Jetson上原距离33项、新显示模型17项、启动器5项共55项测试通过。用800x480、1024x600、1920x1080三种大小检查有效强度、满强度、0和未知，共12组Qt布局截图，随后又在实际Jetson桌面短暂打开模拟窗口并关闭。第一次小屏测试发现大字高度不够，我调整字号和间距后重新检查，没有通过裁掉文本来掩盖。</w:t>
+      </w:r>
+    </w:p>
+    <w:p>
+      <w:pPr>
+        <w:spacing w:after="20" w:line="264" w:lineRule="auto"/>
+      </w:pPr>
+      <w:r>
+        <w:t>我在独立ROS master内测试实际距离节点到报告、再到Qt窗口的合成链路：人工1.5米显示25%，0.75米显示75%，0.3米显示100%，0.1米显示未知。再停止报告进程，确认旧的75%被清掉，窗口转为提醒程序断流。这5项检查通过。第一次链路测试没有等报告订阅握手就发第一帧，消息错过；补齐连接和首份报告的等待后重测通过。没有因此修改生产算法或把合成点写入原包。</w:t>
+      </w:r>
+    </w:p>
+    <w:p>
+      <w:pPr>
+        <w:spacing w:after="20" w:line="264" w:lineRule="auto"/>
+      </w:pPr>
+      <w:r>
+        <w:t>这些检查只说明窗口和消息链路可运行，并不等于我已经拿着设备实测或验证了穿戴避障。真实自身候选仍未审核，默认不应用屏蔽，窗口可能持续显示近场回波未确认；我不会为了看到一个百分比就扩大删除半径。当前仍是所有可见方向，没有地面分类、速度或马达。我先在桌面看更新，再准备低速拿起观察，不依赖窗口避障，也不盯屏幕走楼梯。</w:t>
+      </w:r>
+    </w:p>
+    <w:p>
+      <w:pPr>
+        <w:spacing w:after="20" w:line="264" w:lineRule="auto"/>
+      </w:pPr>
+      <w:r>
+        <w:t>本机代码在本月work/strength_ui_20261023/code，Jetson独立副本是~/haptic_ws/tools/strength_display_20261023_164459/code，稳定入口仍在~/eno/sh。打开说明保存在docs/提醒强度窗口_打开与试验_20261023.txt。实际距离与过滤源文件保持不变，新文件已与设备逐字节核对。临时ROS检查进程和master已停止，桌面模拟窗口也关闭；没有启动现场采集、建图、相机或马达，没有改网络和系统库。继续把筛选后的代码、说明与日记同步到GitHub，不上传场景点云或内部日志。</w:t>
       </w:r>
     </w:p>
     <w:sectPr>

</xml_diff>

<commit_message>
Record tested shell entry and requested desktop command memo update
</commit_message>
<xml_diff>
--- a/docs/research-diary.docx
+++ b/docs/research-diary.docx
@@ -2913,7 +2913,7 @@
         <w:spacing w:after="20" w:line="264" w:lineRule="auto"/>
       </w:pPr>
       <w:r>
-        <w:t>Jetson上原距离33项、新显示模型17项、启动器5项共55项测试通过。用800x480、1024x600、1920x1080三种大小检查有效强度、满强度、0和未知，共12组Qt布局截图，随后又在实际Jetson桌面短暂打开模拟窗口并关闭。第一次小屏测试发现大字高度不够，我调整字号和间距后重新检查，没有通过裁掉文本来掩盖。</w:t>
+        <w:t>Jetson上原距离33项、新显示模型17项、启动器6项共56项测试通过。用800x480、1024x600、1920x1080三种大小检查有效强度、满强度、0和未知，共12组Qt布局截图，随后又在实际Jetson桌面短暂打开模拟窗口并关闭。第一次小屏测试发现大字高度不够，我调整字号和间距后重新检查，没有通过裁掉文本来掩盖。 最后核对发现shell的Windows换行和source时误传应用参数，统一LF并暂存清空参数后修正，完整稳定入口--help实际执行成功，56项重测通过。</w:t>
       </w:r>
     </w:p>
     <w:p>
@@ -2938,6 +2938,40 @@
       </w:pPr>
       <w:r>
         <w:t>本机代码在本月work/strength_ui_20261023/code，Jetson独立副本是~/haptic_ws/tools/strength_display_20261023_164459/code，稳定入口仍在~/eno/sh。打开说明保存在docs/提醒强度窗口_打开与试验_20261023.txt。实际距离与过滤源文件保持不变，新文件已与设备逐字节核对。临时ROS检查进程和master已停止，桌面模拟窗口也关闭；没有启动现场采集、建图、相机或马达，没有改网络和系统库。继续把筛选后的代码、说明与日记同步到GitHub，不上传场景点云或内部日志。</w:t>
+      </w:r>
+    </w:p>
+    <w:p>
+      <w:pPr>
+        <w:keepNext/>
+        <w:pageBreakBefore w:val="0"/>
+        <w:spacing w:after="20" w:line="264" w:lineRule="auto"/>
+        <w:jc w:val="left"/>
+      </w:pPr>
+      <w:r>
+        <w:rPr>
+          <w:rFonts w:ascii="Microsoft YaHei" w:hAnsi="Microsoft YaHei"/>
+          <w:color w:val="000000"/>
+          <w:sz w:val="20"/>
+        </w:rPr>
+        <w:t>2026年10月23日</w:t>
+        <w:br/>
+      </w:r>
+      <w:r>
+        <w:rPr>
+          <w:rFonts w:ascii="Microsoft YaHei" w:hAnsi="Microsoft YaHei" w:eastAsia="Microsoft YaHei"/>
+          <w:b/>
+          <w:color w:val="000000"/>
+          <w:sz w:val="24"/>
+        </w:rPr>
+        <w:t>把窗口启动命令加入桌面备忘</w:t>
+      </w:r>
+    </w:p>
+    <w:p>
+      <w:pPr>
+        <w:spacing w:after="20" w:line="264" w:lineRule="auto"/>
+      </w:pPr>
+      <w:r>
+        <w:t>我希望仍然使用桌面上的sh.txt复制命令，所以只在末尾追加bash ~/eno/sh/start_haptic_strength.sh，放在第21行。原来的MID-360启动命令已经在文件中，没有重复添加；摄像头、建图、录包和回放命令全部保持，核对原文件字节前缀未变。修改前的备份按月份保存在~/haptic_ws/backups/2026-10。只改了这份备忘，没有因此启动扫描或窗口，也没有把内部备忘全文上传。</w:t>
       </w:r>
     </w:p>
     <w:sectPr>

</xml_diff>

<commit_message>
Record rolling filter debugging, confirmed scope and remaining sparse returns
</commit_message>
<xml_diff>
--- a/docs/research-diary.docx
+++ b/docs/research-diary.docx
@@ -2972,6 +2972,114 @@
       </w:pPr>
       <w:r>
         <w:t>我希望仍然使用桌面上的sh.txt复制命令，所以只在末尾追加bash ~/eno/sh/start_haptic_strength.sh，放在第21行。原来的MID-360启动命令已经在文件中，没有重复添加；摄像头、建图、录包和回放命令全部保持，核对原文件字节前缀未变。修改前的备份按月份保存在~/haptic_ws/backups/2026-10。只改了这份备忘，没有因此启动扫描或窗口，也没有把内部备忘全文上传。</w:t>
+      </w:r>
+    </w:p>
+    <w:p>
+      <w:pPr>
+        <w:pStyle w:val="Heading2"/>
+        <w:pageBreakBefore/>
+      </w:pPr>
+      <w:r>
+        <w:rPr>
+          <w:color w:val="000000"/>
+        </w:rPr>
+        <w:t>2026年10月23日 调试滚动近点过滤并重新确认排除规则</w:t>
+      </w:r>
+    </w:p>
+    <w:p>
+      <w:pPr>
+        <w:spacing w:after="60" w:line="264" w:lineRule="auto"/>
+      </w:pPr>
+      <w:r>
+        <w:t>我把第一阶段的想法重新说明为50 cm范围加滚动10秒，不再只在开机时初始化一次。我希望固定在雷达附近的回波被持续忽略，而人或墙相对雷达移动到新位置时重新参与提醒。这是时间和空间上的排除规则，不是识别人体类别。我同时想知道两个启动命令是否已经包含距离判断，确认启动脚本会按需启动距离节点和只读窗口，计算策略文件则由节点导入。</w:t>
+      </w:r>
+    </w:p>
+    <w:p>
+      <w:pPr>
+        <w:spacing w:after="60" w:line="264" w:lineRule="auto"/>
+      </w:pPr>
+      <w:r>
+        <w:t>检查正在运行的程序时，我发现原来的自身排除计数为0，是因为未加载人工审核配置，初始化工具也没有自动接入实时节点。另外旧距离节点频繁报告消息时间异常，而同话题的新订阅端时间正常。我将独立版本的点云订阅接收缓存增至16 MiB，队列仍为1，不修改驱动和建图。之后两次短时真实观察没有再出现STALE_OR_FUTURE_HEADER，但这不代表所有负载和长时条件都已经验证。</w:t>
+      </w:r>
+    </w:p>
+    <w:p>
+      <w:pPr>
+        <w:spacing w:after="60" w:line="264" w:lineRule="auto"/>
+      </w:pPr>
+      <w:r>
+        <w:t>我先实现了滚动过滤实验：使用雷达局部坐标，2 cm体素，最近10秒内只统计距离50 cm以内的有效点，先用过去历史判断当前帧，避免一个新点立刻屏蔽自己。最初按每帧80%稳定性筛选，后来考虑非重复扫描不保证每帧命中同一格，改为0.5秒合并命中，20个小窗口中至少16个命中，五个2秒子窗口各至少两个命中。这个稳定性门槛是当前实现选择，并不是已经和我完全确认的最终要求。</w:t>
+      </w:r>
+    </w:p>
+    <w:p>
+      <w:pPr>
+        <w:spacing w:after="60" w:line="264" w:lineRule="auto"/>
+      </w:pPr>
+      <w:r>
+        <w:t>实验版最初把过滤后的结果一律标为未验证，所以即使排除成功，窗口也没有正式强度。我把它接到原型距离提醒，保留屏蔽区域不代表安全的说明。对于仍未排除的小于20 cm回波，程序保守输出近场强提醒，距离仅供参考，而不是静默删除。窗口把计数改成滚动排除点（本帧），不再和人工审核的自身排除点混淆；数字是每帧数量，不是累计值。</w:t>
+      </w:r>
+    </w:p>
+    <w:p>
+      <w:pPr>
+        <w:spacing w:after="60" w:line="264" w:lineRule="auto"/>
+      </w:pPr>
+      <w:r>
+        <w:t>我又发现滑动窗口在实际处理速度低于每秒10帧时，会因为最老保留帧的位置而反复跳回统计状态。我将启动满10秒与窗口最老帧的位置分开判断，并补上低帧率回归。设备上76项测试通过，本机75项通过、1项因缺少SciPy跳过。合成ROS链路验证了固定近点排除后1.5 m对应25%、新位置0.3 m目标出现后100%、目标移除后回到25%；断流后清空强度，恢复输入则重新统计。这不是实际拿起设备移动的结果。</w:t>
+      </w:r>
+    </w:p>
+    <w:p>
+      <w:pPr>
+        <w:spacing w:after="60" w:line="264" w:lineRule="auto"/>
+      </w:pPr>
+      <w:r>
+        <w:t>新版已经接到原来的启动入口，替换时只结束旧提醒启动器及它的两个子进程，原建图和雷达驱动进程保持。最后连续30秒观察收到191份报告，全部为NEAR_FIELD_ALERT，没有重新跳回统计或报消息时间异常；本帧滚动排除数最高1280。但最后仍有26个近点留下，最近约0.10 m，因此强度仍为100%。这证明程序会过滤、会提醒，不证明已经实现了我希望的近身全部排除效果。</w:t>
+      </w:r>
+    </w:p>
+    <w:p>
+      <w:pPr>
+        <w:spacing w:after="60" w:line="264" w:lineRule="auto"/>
+      </w:pPr>
+      <w:r>
+        <w:t>我在窗口里也看到距离仍是0.1 m，因此提出不能只看排除数量大于0就算成功，并要求先问清楚需求。我和当前实现的分歧可能在于：50 cm内要排除高频稳定区域，还是最近10秒出现过的区域都排除，或者所有50 cm内点都不参与提醒。暂时停止进一步调参，等待确认新物体进入30 cm时应立即提醒还是先忽略。实际物理移动尚未获得明确完成反馈，不能把静止观察冒充移动验证。</w:t>
+      </w:r>
+    </w:p>
+    <w:p>
+      <w:pPr>
+        <w:spacing w:after="60" w:line="264" w:lineRule="auto"/>
+      </w:pPr>
+      <w:r>
+        <w:t>随后我确认了具体规则：只排除最近10秒位置稳定的50 cm内近点，新出现的物体先强提醒。对于坐着一段时间后移动、旧背景重新被提醒的连贯性问题，我决定留到第三阶段处理，第二阶段暂时不加入速度或轨迹关联。这两项需求已经确认，不再处于等待澄清状态。</w:t>
+      </w:r>
+    </w:p>
+    <w:p>
+      <w:pPr>
+        <w:spacing w:after="60" w:line="264" w:lineRule="auto"/>
+      </w:pPr>
+      <w:r>
+        <w:t>我另外保存了160帧、约15.9秒的近点用于检查残留，并保留原始样本。部分残留点距离稳定小格中心只有约1至2厘米，因此增加了1 cm小格表面容差，仍严格限在50 cm内，不屏蔽整个方向。同一段数据的60个成熟帧比较中，最近残留距离中位数从约0.1014 m变成约0.1254 m；最后一帧20 cm内残留从19点降到4点，但只有5帧完全没有20 cm内残留。这是同场景参数比较，不能当作独立精度验证。新增容差反例也显示，新外物若贴得太近而落入容差区，同样可能被忽略。</w:t>
+      </w:r>
+    </w:p>
+    <w:p>
+      <w:pPr>
+        <w:spacing w:after="60" w:line="264" w:lineRule="auto"/>
+      </w:pPr>
+      <w:r>
+        <w:t>设备上78项测试通过，本机77项通过、1项因缺少SciPy跳过。新增两个测试第一次失败，是测试输入跨过了0.5秒断流重置门槛；修正连续输入的时间安排后通过，未删除重置保护。五项合成ROS链路检查在新容差版再次通过。切换窗口时还发现，等旧程序3秒并不足以确保旧距离节点退出，新窗口可能复用一个马上退出的发布者。我改成等待旧子进程退出并确认旧report发布者消失后再启动；读取内核children文件的首次办法不可用，改用进程父子列表。没有重启雷达驱动或Point-LIO。</w:t>
+      </w:r>
+    </w:p>
+    <w:p>
+      <w:pPr>
+        <w:spacing w:after="60" w:line="264" w:lineRule="auto"/>
+      </w:pPr>
+      <w:r>
+        <w:t>新版本最后30秒收到198份真实报告，包括88份启动统计、105份近场强提醒、1份距离候选和4份更近孤立回波未确认。成熟110帧，本帧滚动排除最高1425点；最后剩2个小于20 cm的点，最近约0.102 m，仍显示强提醒。因此不能说近身残留已经彻底解决。新版保留在独立工具目录，原来的启动命令不变。真实移动或已知距离物体对照尚未完成。</w:t>
+      </w:r>
+    </w:p>
+    <w:p>
+      <w:pPr>
+        <w:spacing w:after="60" w:line="264" w:lineRule="auto"/>
+      </w:pPr>
+      <w:r>
+        <w:t>为避免盲目把残留点全说成噪声，我查了Livox官方MID-360协议的标签定义并做了只读检查。另一段成熟55帧中，残留近点累计标签0有79点、16有49点、32有4点，只有4帧完全没有近点。正常置信度标签也有残留，因此没有直接按标签删除。下一项待我选择的是：零散1至2个点是否先用邻域支持作为孤立噪点处理；这种方法可能减少误报，但细线和细杆也可能漏检。若要求任何近点都立即强提醒，就必须暂时接受当前误报。不能为了宣布成功而同时承诺二者都保证。</w:t>
       </w:r>
     </w:p>
     <w:sectPr>

</xml_diff>

<commit_message>
Document verified stationary contract and remaining stability limitations
</commit_message>
<xml_diff>
--- a/docs/research-diary.docx
+++ b/docs/research-diary.docx
@@ -3080,6 +3080,49 @@
       </w:pPr>
       <w:r>
         <w:t>为避免盲目把残留点全说成噪声，我查了Livox官方MID-360协议的标签定义并做了只读检查。另一段成熟55帧中，残留近点累计标签0有79点、16有49点、32有4点，只有4帧完全没有近点。正常置信度标签也有残留，因此没有直接按标签删除。下一项待我选择的是：零散1至2个点是否先用邻域支持作为孤立噪点处理；这种方法可能减少误报，但细线和细杆也可能漏检。若要求任何近点都立即强提醒，就必须暂时接受当前误报。不能为了宣布成功而同时承诺二者都保证。</w:t>
+      </w:r>
+    </w:p>
+    <w:p>
+      <w:pPr>
+        <w:pStyle w:val="Heading2"/>
+      </w:pPr>
+      <w:r>
+        <w:rPr>
+          <w:color w:val="000000"/>
+        </w:rPr>
+        <w:t>2026年10月23日 核对静止十秒后是否必须没有近点</w:t>
+      </w:r>
+    </w:p>
+    <w:p>
+      <w:pPr>
+        <w:spacing w:after="60" w:line="264" w:lineRule="auto"/>
+      </w:pPr>
+      <w:r>
+        <w:t>我提出一个新的检查标准：如果设备一直静止，50 cm范围加滚动10秒，是否应当在10秒后只显示50 cm以外的距离。我要求先自行验证，确认有程序错误再修改，而不是只用排除数量增加作为成功依据。这里需要区分同一批点完全不变，以及设备不动但雷达仍有非重复扫描、量测抖动、偶发回波两种情况。</w:t>
+      </w:r>
+    </w:p>
+    <w:p>
+      <w:pPr>
+        <w:spacing w:after="60" w:line="264" w:lineRule="auto"/>
+      </w:pPr>
+      <w:r>
+        <w:t>我新增五项针对性回归：200个固定近点在满10秒后全部排除；固定近点加0.8 m目标时输出0.8 m；只有固定近点、排除后没有外点时保持未知而不编造大于50 cm的距离；设备不动但新增0.1 m回波时仍强提醒；每秒只偶尔命中的近点不会自动成为稳定区域。设备83项测试全部通过，本机82项通过、1项因缺少SciPy跳过。新增的只是测试文件，七个运行源文件核对一致，未重启现场进程。</w:t>
+      </w:r>
+    </w:p>
+    <w:p>
+      <w:pPr>
+        <w:spacing w:after="60" w:line="264" w:lineRule="auto"/>
+      </w:pPr>
+      <w:r>
+        <w:t>我又读取之前保存的近点样本，对60个成熟帧重新按时间小窗口和稳定格几何范围核对。总共1114个未排除点中，符合当前稳定格及1 cm容差却漏排的数量为0。每帧最近残留点所在格只命中20个时间小窗口中的0至15个，没有达到当前16个门槛。这个结果说明没有复现固定稳定近点漏排，但不能证明物理身体被完整识别；稳定性规则仍可能对真实近身回波过于严格。</w:t>
+      </w:r>
+    </w:p>
+    <w:p>
+      <w:pPr>
+        <w:spacing w:after="60" w:line="264" w:lineRule="auto"/>
+      </w:pPr>
+      <w:r>
+        <w:t>因此我没有为了满足显示大于50 cm而把全部近点强行删除，也没有改成只要出现过就忽略。稳定近点的过滤动作在这些用例中正常，真实残留问题仍然存在，不能把这次回归通过称为整个目标完成。之前关于是否允许邻域支持过滤孤立点的选择仍待确认；本轮没有新增去噪、速度、运动连续性或马达功能，也没有修改驱动、建图或原始样本。</w:t>
       </w:r>
     </w:p>
     <w:sectPr>

</xml_diff>

<commit_message>
Document motion prototype tests and research diary
</commit_message>
<xml_diff>
--- a/docs/research-diary.docx
+++ b/docs/research-diary.docx
@@ -3123,6 +3123,98 @@
       </w:pPr>
       <w:r>
         <w:t>因此我没有为了满足显示大于50 cm而把全部近点强行删除，也没有改成只要出现过就忽略。稳定近点的过滤动作在这些用例中正常，真实残留问题仍然存在，不能把这次回归通过称为整个目标完成。之前关于是否允许邻域支持过滤孤立点的选择仍待确认；本轮没有新增去噪、速度、运动连续性或马达功能，也没有修改驱动、建图或原始样本。</w:t>
+      </w:r>
+    </w:p>
+    <w:p>
+      <w:pPr>
+        <w:pStyle w:val="Heading2"/>
+        <w:pageBreakBefore/>
+      </w:pPr>
+      <w:r>
+        <w:rPr>
+          <w:color w:val="000000"/>
+        </w:rPr>
+        <w:t>2026年10月23日 加入速度和停留时间并处理孤立近点</w:t>
+      </w:r>
+    </w:p>
+    <w:p>
+      <w:pPr>
+        <w:spacing w:after="60" w:line="264" w:lineRule="auto"/>
+      </w:pPr>
+      <w:r>
+        <w:t>我决定先按邻域支持过滤零散的近点，再根据剩下的成团目标提醒。我接受细线、细杆或回波很少的小物体可能漏检的原型限制，因此把孤立点排除数和滚动排除数分开，不把去噪说成识别了身体。50 cm内滚动10秒的规则继续保留，新出现的成团近物仍应提醒。</w:t>
+      </w:r>
+    </w:p>
+    <w:p>
+      <w:pPr>
+        <w:spacing w:after="60" w:line="264" w:lineRule="auto"/>
+      </w:pPr>
+      <w:r>
+        <w:t>第三步我希望不仅看距离，还考虑相对接近速度和停留时间：快速接近时增强，停在附近后缓慢减弱，但不能直接减为没有危险。我用Python分别编写motion_tracking、motion_pipeline、motion_background、motion_pose、motion_support、motion_node和motion_display等文件。代码放在2026-10/work/motion_v3_20261023/code，并部署到设备的~/haptic_ws/tools/motion_v3_20261023/code。新入口是bash ~/eno/sh/start_haptic_motion.sh；加--demo只看明确标注的模拟。旧R4入口保留作对照，不修改原驱动、网络和建图。</w:t>
+      </w:r>
+    </w:p>
+    <w:p>
+      <w:pPr>
+        <w:spacing w:after="60" w:line="264" w:lineRule="auto"/>
+      </w:pPr>
+      <w:r>
+        <w:t>我直接从雷达点云计算当前距离，而不是把累计地图当作现在存在的障碍。跨帧关联则读取现有Point-LIO位姿。我检查了实际源码中雷达点到IMU坐标的变换方向，使用已经加载的固定外参，不新增或猜测TF。没有可靠位姿时只给相对距离模式，不开启依赖世界坐标的停留减弱。</w:t>
+      </w:r>
+    </w:p>
+    <w:p>
+      <w:pPr>
+        <w:spacing w:after="60" w:line="264" w:lineRule="auto"/>
+      </w:pPr>
+      <w:r>
+        <w:t>我采用SciPy邻域查询、连通分量聚类和线性分配来关联目标，并用多帧距离的斜率求相对接近速度。最近10帧至少3帧且跨度0.2秒，拟合残差不超过3 cm才使用速度；TTC只是距离除以接近速度的参考，不是完整碰撞预测。宽墙的中心变化不适合当作物体速度。强度以原距离结果为基础，速度和TTC可增强到100%；可靠静止2秒后指数减弱，通常保留40%，50 cm内保留60%。未解释的小于20 cm成团近回波仍100%。这些是待实验检验的默认系数，并未从人体试验拟合。</w:t>
+      </w:r>
+    </w:p>
+    <w:p>
+      <w:pPr>
+        <w:spacing w:after="60" w:line="264" w:lineRule="auto"/>
+      </w:pPr>
+      <w:r>
+        <w:t>我还处理了两个连续性问题。旧滚动忽略区域在可靠位姿下、小幅移动和严格空间匹配时最多延续10秒，延续本身不能刷新记忆，避免逐渐走近墙时一直被忽略。已经从远处跟踪到近处的小目标则作窄范围保护，避免停10秒后被学没。这些规则不能证明点属于身体，也不能把屏蔽空间当作安全空间。</w:t>
+      </w:r>
+    </w:p>
+    <w:p>
+      <w:pPr>
+        <w:spacing w:after="60" w:line="264" w:lineRule="auto"/>
+      </w:pPr>
+      <w:r>
+        <w:t>测试中我发现微小正速度会让停留衰减被原强度顶回去。我先添加回归复现，再加入停止速度死区修复。还修正过不合理的测试预期：较远目标不应仅因有速度就必定覆盖近目标，需要综合TTC和风险。最初的保护区域偏宽，真实观察中恢复了太多近点，之后缩小到已从远处追踪到的小目标范围，保留原失败记录。</w:t>
+      </w:r>
+    </w:p>
+    <w:p>
+      <w:pPr>
+        <w:spacing w:after="60" w:line="264" w:lineRule="auto"/>
+      </w:pPr>
+      <w:r>
+        <w:t>孤立点过滤最初采用递归邻域修剪，真实大点云计算偏慢，第一段54份报告始终没有完成稳定统计；改用第4近邻查询后，第二段84份中又出现10次修剪迭代上限。因此我改成单次半径离群点过滤：8 cm内至少3个其他回波，不在删点后的集合递归侵蚀边缘。原距离策略增加默认行为不变的支持检查接口，第三步复用已检查结果；设备现场R4源不变。新增参考算法一致性测试。</w:t>
+      </w:r>
+    </w:p>
+    <w:p>
+      <w:pPr>
+        <w:spacing w:after="60" w:line="264" w:lineRule="auto"/>
+      </w:pPr>
+      <w:r>
+        <w:t>最终设备136项单元测试通过，隔离ROS的11个合成场景通过，涵盖接近、停止减弱、近处停留超过10秒仍保留目标、新近物、断流、重启、小幅移动旧背景、大幅靠近和丢位姿。模拟中0.8 m目标以约1 m/s接近时100%，停止后约29%；0.3 m停留仍至少60%，未解释近场成团点100%。这些数字来自合成输入，不是实测精度。窗口12组布局检查通过，模拟入口在设备桌面可启动并关闭。</w:t>
+      </w:r>
+    </w:p>
+    <w:p>
+      <w:pPr>
+        <w:spacing w:after="60" w:line="264" w:lineRule="auto"/>
+      </w:pPr>
+      <w:r>
+        <w:t>最后一段约23秒现场只读观察收到133份报告：1份无数据、83份启动统计、46份距离候选和3份近场强提醒，没有计算超时。132份继承了现有固定外参，49份有效报告使用世界坐标补偿。原驱动、Point-LIO、旧提醒进程及受保护文件核对未变，本次测试子进程已退出。仍有成团近场残留，不能说所有近点都消失，也不能把静止短测当作行走、误报率或安全验证。</w:t>
+      </w:r>
+    </w:p>
+    <w:p>
+      <w:pPr>
+        <w:spacing w:after="60" w:line="264" w:lineRule="auto"/>
+      </w:pPr>
+      <w:r>
+        <w:t>我把第三步软件原型推进到可以运行和合成验证的状态，未接马达，未进行真实速度标定、多人交叉、细杆漏检、人体佩戴和楼梯试验。下一次应在有人协助的平地上用已知距离软箱逐项检查，不依赖原型避障。详细命令和限制放在第三步运动融合提醒说明中，公开副本只保留代码、方法和汇总，不放点云、场景配置或连接信息。</w:t>
       </w:r>
     </w:p>
     <w:sectPr>

</xml_diff>

<commit_message>
Record first recurring audit and confirmed singleton failure
</commit_message>
<xml_diff>
--- a/docs/research-diary.docx
+++ b/docs/research-diary.docx
@@ -3215,6 +3215,57 @@
       </w:pPr>
       <w:r>
         <w:t>我把第三步软件原型推进到可以运行和合成验证的状态，未接马达，未进行真实速度标定、多人交叉、细杆漏检、人体佩戴和楼梯试验。下一次应在有人协助的平地上用已知距离软箱逐项检查，不依赖原型避障。详细命令和限制放在第三步运动融合提醒说明中，公开副本只保留代码、方法和汇总，不放点云、场景配置或连接信息。</w:t>
+      </w:r>
+    </w:p>
+    <w:p>
+      <w:pPr>
+        <w:pStyle w:val="Heading2"/>
+      </w:pPr>
+      <w:r>
+        <w:rPr>
+          <w:color w:val="000000"/>
+        </w:rPr>
+        <w:t>2026年10月24日 定期离线排查与过滤后孤点的复现</w:t>
+      </w:r>
+    </w:p>
+    <w:p>
+      <w:pPr>
+        <w:spacing w:after="60" w:line="264" w:lineRule="auto"/>
+      </w:pPr>
+      <w:r>
+        <w:t>离开前，我决定关闭雷达、让Jetson继续开机，把排错和代码简化分批进行。已有定时任务已改成每6小时继续同一个对话，本次运行是第一次实际触发。我把第三版静止十秒后还显示50 cm以内点的问题放在第一位，之后再处理边界、重复代码、注释和启动流程。运行还需要本机电脑与应用保持可用，并受账号用量限制；不能只因为设了定时就保证每次都成功。</w:t>
+      </w:r>
+    </w:p>
+    <w:p>
+      <w:pPr>
+        <w:spacing w:after="60" w:line="264" w:lineRule="auto"/>
+      </w:pPr>
+      <w:r>
+        <w:t>这次我读取此前保存的160帧近点，时长15.90秒。文件只有50 cm内的点，没有远处点云或同步位姿，因此不能从它恢复真实完整环境。我用同一输入对照R4和第三版：60个成熟帧中，R4有55帧近场强提醒；第三版无位姿模式有4帧近场强提醒、32帧近距离候选、24帧没有剩余观测。两版滚动删除总数相同，第三版另外删除946个孤立点，轨迹保护恢复点数为0。这说明这段样本的残留不能归咎于轨迹保护把点加回来。</w:t>
+      </w:r>
+    </w:p>
+    <w:p>
+      <w:pPr>
+        <w:spacing w:after="60" w:line="264" w:lineRule="auto"/>
+      </w:pPr>
+      <w:r>
+        <w:t>为了单独检查其他环节，我又加了明确标注的合成0.8 m目标和单位位姿。无位姿时仍有36个成熟帧显示近距离；加入合成单位位姿后降为13帧，其中背景延续又排除335点。单位位姿只是控制变量，不能当作当时真实的位姿。固定近点加远处目标的合成对照最终显示0.8 m；从远处接近并在0.3 m停下的目标，则被第三步的轨迹保护继续保留。后一项是现有规则有意产生的效果，与所有静止近物都必须消失的要求存在区别。</w:t>
+      </w:r>
+    </w:p>
+    <w:p>
+      <w:pPr>
+        <w:spacing w:after="60" w:line="264" w:lineRule="auto"/>
+      </w:pPr>
+      <w:r>
+        <w:t>我进一步构造了一个具体反例：中心点在0.1 m，周围有三个点。过滤前中心有足够邻居，外围三个点各自支持不足，被删掉后只剩中心一个点。当前第三版仍输出0.1 m和100%近场提醒，但附近没有形成有效轨迹。这确认了去噪前有支持与去噪后仍成团之间存在漏洞，违背了我选择的按成团目标提醒。复现程序为reproduce_support_orphan.py，设备实际运行已得到这一结果。</w:t>
+      </w:r>
+    </w:p>
+    <w:p>
+      <w:pPr>
+        <w:spacing w:after="60" w:line="264" w:lineRule="auto"/>
+      </w:pPr>
+      <w:r>
+        <w:t>本轮只完成定位和可复现反例，没有修改运行算法，也没有启动真实驱动、建图、相机、马达或重新采集。原样本核对未变。下一批先修复过滤后孤点仍进入距离计算的问题，并检查会不会再次造成大点云计算超时；之后再用同一近点样本复算。这个反例解释了一种会出现0.1 m误提醒的路径，但尚不能证明它覆盖了现场全部残留，也不能把离线结果说成身体身份或穿戴安全验证。</w:t>
       </w:r>
     </w:p>
     <w:sectPr>

</xml_diff>

<commit_message>
Document isolated group-filter fix and measured performance cost
</commit_message>
<xml_diff>
--- a/docs/research-diary.docx
+++ b/docs/research-diary.docx
@@ -3266,6 +3266,66 @@
       </w:pPr>
       <w:r>
         <w:t>本轮只完成定位和可复现反例，没有修改运行算法，也没有启动真实驱动、建图、相机、马达或重新采集。原样本核对未变。下一批先修复过滤后孤点仍进入距离计算的问题，并检查会不会再次造成大点云计算超时；之后再用同一近点样本复算。这个反例解释了一种会出现0.1 m误提醒的路径，但尚不能证明它覆盖了现场全部残留，也不能把离线结果说成身体身份或穿戴安全验证。</w:t>
+      </w:r>
+    </w:p>
+    <w:p>
+      <w:pPr>
+        <w:pStyle w:val="Heading2"/>
+        <w:pageBreakBefore/>
+      </w:pPr>
+      <w:r>
+        <w:rPr>
+          <w:color w:val="000000"/>
+        </w:rPr>
+        <w:t>2026年10月24日 修复去噪后的孤点并记录计算开销</w:t>
+      </w:r>
+    </w:p>
+    <w:p>
+      <w:pPr>
+        <w:spacing w:after="60" w:line="264" w:lineRule="auto"/>
+      </w:pPr>
+      <w:r>
+        <w:t>这轮我先把上一次发现的四点反例写成回归测试，确认旧版确实失败，再修改独立测试副本。我没有把50 cm内的点全部删除，而是在原有的一次邻域去噪后，检查留下的点是否还能连成至少4点的小组。连接半径沿用8 cm，成组条件与单个点有几个邻居分开处理，所以不会反复剥掉边缘直到整个物体消失。这个方法仍然只是几何过滤，不能说明这些点一定属于人体或支架。</w:t>
+      </w:r>
+    </w:p>
+    <w:p>
+      <w:pPr>
+        <w:spacing w:after="60" w:line="264" w:lineRule="auto"/>
+      </w:pPr>
+      <w:r>
+        <w:t>运行逻辑只修改了motion_support.py，增加了剩余小组检查和被删除小组点数的记录。test_motion_groups.py补充8项测试，包含孤点、无剩余观测、新成团近目标、重复坐标和链状组。设备上的144项单元测试全部通过，没有跳过；本机针对性测试实际通过11项，另外3项因没有SciPy而跳过，不能算作本机通过。</w:t>
+      </w:r>
+    </w:p>
+    <w:p>
+      <w:pPr>
+        <w:spacing w:after="60" w:line="264" w:lineRule="auto"/>
+      </w:pPr>
+      <w:r>
+        <w:t>用同一反例对照旧版与修复副本，旧版最后保留1个0.1 m点，输出100%提醒；修复后该孤点不再参与距离，显示合成的0.8 m目标，强度为70%。如果没有其他剩余点，结果是未知，不是安全或零强度。另一个测试确认，新出现的成团0.1 m目标仍然输出100%提醒。固定近点加远目标的滚动测试也保持通过，没有改变10秒学习规则。</w:t>
+      </w:r>
+    </w:p>
+    <w:p>
+      <w:pPr>
+        <w:spacing w:after="60" w:line="264" w:lineRule="auto"/>
+      </w:pPr>
+      <w:r>
+        <w:t>我又用此前160帧近点样本复算。60个统计成熟帧中，无位姿模式显示50 cm内距离的帧数从36降为19，其中3帧为近场提醒、16帧为距离候选，其余41帧没有剩余观测。新增小组检查使累计去噪点数从946增至991。这只是同一份近点裁剪样本的前后对照，没有远处真实点或位姿，也没有障碍真值，所以不能说误报率下降了多少，更不能说全部残留已经修完。</w:t>
+      </w:r>
+    </w:p>
+    <w:p>
+      <w:pPr>
+        <w:spacing w:after="60" w:line="264" w:lineRule="auto"/>
+      </w:pPr>
+      <w:r>
+        <w:t>我同时测了计算开销，发现不能只看功能测试通过。2万点稠密合成输入中，距离过滤部分的5次测量中位数从约64.6 ms增加到132.0 ms，最高约133.0 ms；2000点从约5.2 ms增加到10.7 ms。它没有再做无界递归，但额外的邻域查询仍有明显成本。这不是整条实时管线的帧率，也不能直接证明实时达标。下一批先优化这部分开销并保持分组结果一致，再检查残留点。</w:t>
+      </w:r>
+    </w:p>
+    <w:p>
+      <w:pPr>
+        <w:spacing w:after="60" w:line="264" w:lineRule="auto"/>
+      </w:pPr>
+      <w:r>
+        <w:t>修复副本保存在maintenance02_group_fix_20261024/code，Jetson上也使用独立的同名haptic测试目录。没有切换现有启动命令，没有修改旧R4或原第三版目录，也没有启动雷达、建图、相机或马达。原始样本核对未变。现场穿戴、运动精度、漏检率和安全性仍未验证；当前可确认的是这个孤点反例已经被修复。</w:t>
       </w:r>
     </w:p>
     <w:sectPr>

</xml_diff>

<commit_message>
Record equivalent filtering results and lower offline query cost
</commit_message>
<xml_diff>
--- a/docs/research-diary.docx
+++ b/docs/research-diary.docx
@@ -3326,6 +3326,66 @@
       </w:pPr>
       <w:r>
         <w:t>修复副本保存在maintenance02_group_fix_20261024/code，Jetson上也使用独立的同名haptic测试目录。没有切换现有启动命令，没有修改旧R4或原第三版目录，也没有启动雷达、建图、相机或马达。原始样本核对未变。现场穿戴、运动精度、漏检率和安全性仍未验证；当前可确认的是这个孤点反例已经被修复。</w:t>
+      </w:r>
+    </w:p>
+    <w:p>
+      <w:pPr>
+        <w:pStyle w:val="Heading2"/>
+        <w:pageBreakBefore/>
+      </w:pPr>
+      <w:r>
+        <w:rPr>
+          <w:color w:val="000000"/>
+        </w:rPr>
+        <w:t>2026年10月24日 复用邻域查询以减少过滤开销</w:t>
+      </w:r>
+    </w:p>
+    <w:p>
+      <w:pPr>
+        <w:spacing w:after="60" w:line="264" w:lineRule="auto"/>
+      </w:pPr>
+      <w:r>
+        <w:t>上一次修好了过滤后只剩孤点却仍触发强提醒的问题，但增加了计算开销。这次我只优化这个环节，没有修改50 cm、滚动10秒、8 cm邻域或至少4点成组的规则。我发现第一次查询已经知道每个点的近邻，如果这些近邻在去噪后都还存在，就已经能证明该点属于足够大的组，不必再查一次。仍不确定的点才进行第二次查询；如果它们连到了已经确认的组，也应保留。这里的确认仅指组大小，不是确认身体身份。</w:t>
+      </w:r>
+    </w:p>
+    <w:p>
+      <w:pPr>
+        <w:spacing w:after="60" w:line="264" w:lineRule="auto"/>
+      </w:pPr>
+      <w:r>
+        <w:t>我在motion_support.py里复用本帧查询返回的邻居下标，不把邻居缓存到下一帧，也没有新增运行入口。参考版的完整半径图检查保留不动，用来检验优化结果。新增test_motion_support_reuse.py的4项测试，包括带孤立点的稠密云只建一次树、不同最小邻居数的随机对照、连接到已确认组的尾部点以及跨帧不沿用证据。旧模块在建树次数测试中实际得到2次，优化后为1次。</w:t>
+      </w:r>
+    </w:p>
+    <w:p>
+      <w:pPr>
+        <w:spacing w:after="60" w:line="264" w:lineRule="auto"/>
+      </w:pPr>
+      <w:r>
+        <w:t>设备上的148项单元测试全部通过，无跳过。本机针对性测试通过11项，7项因缺少SciPy而跳过。测试辅助脚本第一次运行有一处换行语法错误，在连接设备前就退出了；补上括号后才开始设备验证。随后我对照了160帧已有近点和旧包中等间隔抽取的12帧完整点云，报告与保留点数组逐项一致。四种滚动回放设置及合成控制的逐帧结果也与上次完全一致，孤点修复没有被优化撤销。</w:t>
+      </w:r>
+    </w:p>
+    <w:p>
+      <w:pPr>
+        <w:spacing w:after="60" w:line="264" w:lineRule="auto"/>
+      </w:pPr>
+      <w:r>
+        <w:t>这次交替测量旧版和优化版，避免一直让后一版占热缓存优势。2万点稠密合成输入的过滤耗时中位数从131.2 ms降至65.1 ms；再加一个孤立点时，从132.5 ms降至67.4 ms。160帧近点的中位数从6.70 ms降至3.41 ms。12帧真实保存的完整点云，每帧约2万点，中位数从62.6 ms降至44.8 ms，优化后的最大值为47.1 ms。这些是过滤部分的离线计算时间，不是整套节点的实时帧率或穿戴安全结果。</w:t>
+      </w:r>
+    </w:p>
+    <w:p>
+      <w:pPr>
+        <w:spacing w:after="60" w:line="264" w:lineRule="auto"/>
+      </w:pPr>
+      <w:r>
+        <w:t>这轮提高的是速度，没有进一步消除残留：此前无位姿回放在60个成熟帧中仍有19帧显示50 cm内距离，其中3帧近场提醒，这些数字没有变化。我没有为了显示更远而改阈值或清空近点。下一批应分析这些剩余小组的时间支持和来源，再检查输入、时间戳及断流边界；完整实时管线的时延还需要单独验证。</w:t>
+      </w:r>
+    </w:p>
+    <w:p>
+      <w:pPr>
+        <w:spacing w:after="60" w:line="264" w:lineRule="auto"/>
+      </w:pPr>
+      <w:r>
+        <w:t>本机与Jetson的修复测试副本都保存在maintenance03_support_speed_20261024/code。原始bag、近点样本和现场原模块前后哈希一致，没有切换原启动命令，也没有启动真实雷达、建图、相机或马达。公开保存代码、测试和汇总，不上传原始点云、场景几何或私有连接信息。</w:t>
       </w:r>
     </w:p>
     <w:sectPr>

</xml_diff>

<commit_message>
Document residual temporal evidence and bounded next fix
</commit_message>
<xml_diff>
--- a/docs/research-diary.docx
+++ b/docs/research-diary.docx
@@ -3386,6 +3386,66 @@
       </w:pPr>
       <w:r>
         <w:t>本机与Jetson的修复测试副本都保存在maintenance03_support_speed_20261024/code。原始bag、近点样本和现场原模块前后哈希一致，没有切换原启动命令，也没有启动真实雷达、建图、相机或马达。公开保存代码、测试和汇总，不上传原始点云、场景几何或私有连接信息。</w:t>
+      </w:r>
+    </w:p>
+    <w:p>
+      <w:pPr>
+        <w:pStyle w:val="Heading2"/>
+        <w:pageBreakBefore/>
+      </w:pPr>
+      <w:r>
+        <w:rPr>
+          <w:color w:val="000000"/>
+        </w:rPr>
+        <w:t>2026年10月24日 检查剩余近点的时间证据与小格边界</w:t>
+      </w:r>
+    </w:p>
+    <w:p>
+      <w:pPr>
+        <w:spacing w:after="60" w:line="264" w:lineRule="auto"/>
+      </w:pPr>
+      <w:r>
+        <w:t>这轮我继续查静止十秒后还出现近距离的原因，没有再改速度或阈值。我把第三批代码作为不变的基线，新增audit_temporal_support.py，逐点检查过去十秒的命中记录。现有方法把空间分成2 cm小格，十秒分成20个半秒桶；同一格要命中至少16桶，而且五个2秒段各至少命中2桶，才算稳定。1 cm空间容差是在小格已经稳定后才使用的。</w:t>
+      </w:r>
+    </w:p>
+    <w:p>
+      <w:pPr>
+        <w:spacing w:after="60" w:line="264" w:lineRule="auto"/>
+      </w:pPr>
+      <w:r>
+        <w:t>我用同一份160帧近点裁剪样本回放，60个成熟帧仍有19帧留下近点，其中3帧近场强提醒。残留合计123个点次，分成24个组次，每组4到12点；点次和组次都是跨帧累计，不代表123个物体或24个独立物体。我另用诊断计算核对了81803个原始近点的删除判断，与运行代码逐点一致。残留中没有本来符合当前稳定格及容差却漏删的点，轨迹保护恢复计数也为0。</w:t>
+      </w:r>
+    </w:p>
+    <w:p>
+      <w:pPr>
+        <w:spacing w:after="60" w:line="264" w:lineRule="auto"/>
+      </w:pPr>
+      <w:r>
+        <w:t>但当前稳定格的定义仍可能把很近的历史证据分开。残留点所在的单格只命中0到15桶，都低于16桶。我只做诊断比较：把当前点距离小格表面1 cm以内的历史命中按桶合并，每桶仍只算一票。有68个点次达到相同的时间要求，19个残留帧中的12帧，其最近点也符合这个合并条件。这支持部分残留与空间统计碎片化有关，但不能证明这些点都是支架，更不能把12帧直接解释成修复后会消失的12次提醒，因为同帧还可能有其他残留。</w:t>
+      </w:r>
+    </w:p>
+    <w:p>
+      <w:pPr>
+        <w:spacing w:after="60" w:line="264" w:lineRule="auto"/>
+      </w:pPr>
+      <w:r>
+        <w:t>为了确认这不是凭感觉推断，我构造了一个合成对照：四点小组在11.9 cm和12.1 cm之间每半秒交替一次，两位置仅差2 mm，远处另放0.8 m的小组。十秒后，两个近格分别只有10桶命中，没有任何格被学成稳定，程序仍输出约11.9 cm的强提醒。完全固定在11.9 cm的对照则排除4个近点，正确显示0.8 m。合并相邻格的诊断证据有20桶，但我还没有把这个合并规则用于运行过滤。</w:t>
+      </w:r>
+    </w:p>
+    <w:p>
+      <w:pPr>
+        <w:spacing w:after="60" w:line="264" w:lineRule="auto"/>
+      </w:pPr>
+      <w:r>
+        <w:t>新增7项诊断测试在Jetson全部通过；本机通过6项，1项整条管线测试因缺少SciPy跳过。最初本机测试暴露了诊断函数没有把列表转成数组的问题，我修正输入转换后才通过；也把依赖SciPy的管线测试明确标为本机跳过。没有修改运行模块，所以这次没有重复跑已经通过且未变化的148项整套回归。原样本和第三批的滚动、支持模块哈希前后相同，没有启动现场硬件。</w:t>
+      </w:r>
+    </w:p>
+    <w:p>
+      <w:pPr>
+        <w:spacing w:after="60" w:line="264" w:lineRule="auto"/>
+      </w:pPr>
+      <w:r>
+        <w:t>本轮工作目录是maintenance04_temporal_audit_20261024，运行算法仍使用第三批的独立副本，现场启动命令仍未替换。下一批先把2 mm边界抖动变成修复回归，尝试在时间统计阶段处理小范围空间容差，并检查新近物、相邻外物和过期历史是否被错误合并。不能扩大成整片50 cm都忽略；合并后仍有55个残留点次不满足时间条件，也需要分别分析。当前结论是找到了可复现的统计薄弱点，还不是完成修复或验证了人体识别。</w:t>
       </w:r>
     </w:p>
     <w:sectPr>

</xml_diff>